<commit_message>
Ex4 readme: page layout like Ex3, full API reference
</commit_message>
<xml_diff>
--- a/submission ex4/readme.docx
+++ b/submission ex4/readme.docx
@@ -4,7 +4,13 @@
   <w:body>
     <w:p>
       <w:pPr>
-        <w:spacing w:after="60"/>
+        <w:spacing w:after="600"/>
+      </w:pPr>
+    </w:p>
+    <w:p>
+      <w:pPr>
+        <w:spacing w:after="80"/>
+        <w:jc w:val="center"/>
       </w:pPr>
       <w:r>
         <w:rPr>
@@ -19,7 +25,8 @@
     </w:p>
     <w:p>
       <w:pPr>
-        <w:spacing w:after="40"/>
+        <w:spacing w:after="60"/>
+        <w:jc w:val="center"/>
       </w:pPr>
       <w:r>
         <w:rPr>
@@ -32,7 +39,8 @@
     </w:p>
     <w:p>
       <w:pPr>
-        <w:spacing w:after="240"/>
+        <w:spacing w:after="480"/>
+        <w:jc w:val="center"/>
       </w:pPr>
       <w:r>
         <w:rPr>
@@ -45,6 +53,7 @@
     <w:p>
       <w:pPr>
         <w:pStyle w:val="Heading1"/>
+        <w:jc w:val="center"/>
       </w:pPr>
       <w:r>
         <w:t xml:space="preserve">Submitted By</w:t>
@@ -68,6 +77,7 @@
       </w:tblGrid>
       <w:tr>
         <w:trPr>
+          <w:cantSplit/>
           <w:tblHeader w:val="off"/>
         </w:trPr>
         <w:tc>
@@ -88,6 +98,10 @@
             </w:tcMar>
           </w:tcPr>
           <w:p>
+            <w:pPr>
+              <w:keepNext/>
+              <w:keepLines/>
+            </w:pPr>
             <w:r>
               <w:rPr>
                 <w:b/>
@@ -115,6 +129,10 @@
             </w:tcMar>
           </w:tcPr>
           <w:p>
+            <w:pPr>
+              <w:keepNext/>
+              <w:keepLines/>
+            </w:pPr>
             <w:r>
               <w:t xml:space="preserve">Nave Kluska</w:t>
             </w:r>
@@ -123,6 +141,7 @@
       </w:tr>
       <w:tr>
         <w:trPr>
+          <w:cantSplit/>
           <w:tblHeader w:val="off"/>
         </w:trPr>
         <w:tc>
@@ -143,6 +162,10 @@
             </w:tcMar>
           </w:tcPr>
           <w:p>
+            <w:pPr>
+              <w:keepNext/>
+              <w:keepLines/>
+            </w:pPr>
             <w:r>
               <w:rPr>
                 <w:b/>
@@ -170,6 +193,10 @@
             </w:tcMar>
           </w:tcPr>
           <w:p>
+            <w:pPr>
+              <w:keepNext/>
+              <w:keepLines/>
+            </w:pPr>
             <w:r>
               <w:t xml:space="preserve">324168160</w:t>
             </w:r>
@@ -178,6 +205,7 @@
       </w:tr>
       <w:tr>
         <w:trPr>
+          <w:cantSplit/>
           <w:tblHeader w:val="off"/>
         </w:trPr>
         <w:tc>
@@ -198,6 +226,10 @@
             </w:tcMar>
           </w:tcPr>
           <w:p>
+            <w:pPr>
+              <w:keepNext w:val="false"/>
+              <w:keepLines/>
+            </w:pPr>
             <w:r>
               <w:rPr>
                 <w:b/>
@@ -225,63 +257,12 @@
             </w:tcMar>
           </w:tcPr>
           <w:p>
+            <w:pPr>
+              <w:keepNext w:val="false"/>
+              <w:keepLines/>
+            </w:pPr>
             <w:r>
               <w:t xml:space="preserve">navekluska@gmail.com</w:t>
-            </w:r>
-          </w:p>
-        </w:tc>
-      </w:tr>
-      <w:tr>
-        <w:trPr>
-          <w:tblHeader w:val="off"/>
-        </w:trPr>
-        <w:tc>
-          <w:tcPr>
-            <w:tcW w:type="dxa" w:w="2400"/>
-            <w:tcBorders>
-              <w:top w:val="single" w:color="D8DBE3" w:sz="6"/>
-              <w:left w:val="single" w:color="D8DBE3" w:sz="6"/>
-              <w:bottom w:val="single" w:color="D8DBE3" w:sz="6"/>
-              <w:right w:val="single" w:color="D8DBE3" w:sz="6"/>
-            </w:tcBorders>
-            <w:shd w:fill="EEF0FD" w:color="auto" w:val="clear"/>
-            <w:tcMar>
-              <w:top w:type="dxa" w:w="70"/>
-              <w:left w:type="dxa" w:w="110"/>
-              <w:bottom w:type="dxa" w:w="70"/>
-              <w:right w:type="dxa" w:w="110"/>
-            </w:tcMar>
-          </w:tcPr>
-          <w:p>
-            <w:r>
-              <w:rPr>
-                <w:b/>
-                <w:bCs/>
-                <w:color w:val="4C5FD5"/>
-              </w:rPr>
-              <w:t xml:space="preserve">GitHub Repository</w:t>
-            </w:r>
-          </w:p>
-        </w:tc>
-        <w:tc>
-          <w:tcPr>
-            <w:tcW w:type="dxa" w:w="5906"/>
-            <w:tcBorders>
-              <w:top w:val="single" w:color="D8DBE3" w:sz="6"/>
-              <w:left w:val="single" w:color="D8DBE3" w:sz="6"/>
-              <w:bottom w:val="single" w:color="D8DBE3" w:sz="6"/>
-              <w:right w:val="single" w:color="D8DBE3" w:sz="6"/>
-            </w:tcBorders>
-            <w:tcMar>
-              <w:top w:type="dxa" w:w="70"/>
-              <w:left w:type="dxa" w:w="110"/>
-              <w:bottom w:type="dxa" w:w="70"/>
-              <w:right w:type="dxa" w:w="110"/>
-            </w:tcMar>
-          </w:tcPr>
-          <w:p>
-            <w:r>
-              <w:t xml:space="preserve">https://github.com/NaveKluska/GuessMarket</w:t>
             </w:r>
           </w:p>
         </w:tc>
@@ -289,12 +270,28 @@
     </w:tbl>
     <w:p>
       <w:pPr>
-        <w:spacing w:after="60"/>
-      </w:pPr>
-    </w:p>
-    <w:p>
-      <w:pPr>
+        <w:pStyle w:val="Heading1"/>
+        <w:jc w:val="center"/>
+      </w:pPr>
+      <w:r>
+        <w:t xml:space="preserve">GitHub Repository</w:t>
+      </w:r>
+    </w:p>
+    <w:p>
+      <w:pPr>
+        <w:keepLines/>
         <w:spacing w:after="120"/>
+        <w:jc w:val="center"/>
+      </w:pPr>
+      <w:r>
+        <w:t xml:space="preserve">https://github.com/NaveKluska/GuessMarket</w:t>
+      </w:r>
+    </w:p>
+    <w:p>
+      <w:pPr>
+        <w:keepLines/>
+        <w:spacing w:after="120"/>
+        <w:jc w:val="center"/>
       </w:pPr>
       <w:r>
         <w:t xml:space="preserve">The web client's source is in the repository's </w:t>
@@ -315,6 +312,7 @@
     <w:p>
       <w:pPr>
         <w:pStyle w:val="Heading1"/>
+        <w:pageBreakBefore/>
       </w:pPr>
       <w:r>
         <w:t xml:space="preserve">The URL to Open</w:t>
@@ -322,25 +320,23 @@
     </w:p>
     <w:p>
       <w:pPr>
-        <w:pBdr>
-          <w:left w:val="single" w:color="4C5FD5" w:sz="24" w:space="8"/>
-        </w:pBdr>
-        <w:shd w:fill="EEF0FD" w:color="auto" w:val="clear"/>
-        <w:spacing w:after="80" w:before="80"/>
+        <w:spacing w:after="200" w:before="200"/>
+        <w:jc w:val="center"/>
       </w:pPr>
       <w:r>
         <w:rPr>
           <w:b/>
           <w:bCs/>
           <w:color w:val="4C5FD5"/>
-          <w:sz w:val="30"/>
-          <w:szCs w:val="30"/>
+          <w:sz w:val="36"/>
+          <w:szCs w:val="36"/>
         </w:rPr>
         <w:t xml:space="preserve">http://localhost:5173</w:t>
       </w:r>
     </w:p>
     <w:p>
       <w:pPr>
+        <w:keepLines/>
         <w:spacing w:after="120"/>
       </w:pPr>
       <w:r>
@@ -366,6 +362,7 @@
     </w:p>
     <w:p>
       <w:pPr>
+        <w:keepLines/>
         <w:spacing w:after="120"/>
       </w:pPr>
       <w:r>
@@ -375,6 +372,7 @@
     <w:p>
       <w:pPr>
         <w:pStyle w:val="ListParagraph"/>
+        <w:keepLines/>
         <w:numPr>
           <w:ilvl w:val="0"/>
           <w:numId w:val="2"/>
@@ -443,6 +441,7 @@
     <w:p>
       <w:pPr>
         <w:pStyle w:val="ListParagraph"/>
+        <w:keepLines/>
         <w:numPr>
           <w:ilvl w:val="0"/>
           <w:numId w:val="2"/>
@@ -493,6 +492,7 @@
     <w:p>
       <w:pPr>
         <w:pStyle w:val="ListParagraph"/>
+        <w:keepLines/>
         <w:numPr>
           <w:ilvl w:val="0"/>
           <w:numId w:val="2"/>
@@ -531,6 +531,7 @@
     <w:p>
       <w:pPr>
         <w:pStyle w:val="ListParagraph"/>
+        <w:keepLines/>
         <w:numPr>
           <w:ilvl w:val="0"/>
           <w:numId w:val="2"/>
@@ -592,6 +593,7 @@
       </w:tblGrid>
       <w:tr>
         <w:trPr>
+          <w:cantSplit/>
           <w:tblHeader/>
         </w:trPr>
         <w:tc>
@@ -612,6 +614,10 @@
             </w:tcMar>
           </w:tcPr>
           <w:p>
+            <w:pPr>
+              <w:keepNext/>
+              <w:keepLines/>
+            </w:pPr>
             <w:r>
               <w:rPr>
                 <w:b/>
@@ -640,6 +646,10 @@
             </w:tcMar>
           </w:tcPr>
           <w:p>
+            <w:pPr>
+              <w:keepNext/>
+              <w:keepLines/>
+            </w:pPr>
             <w:r>
               <w:rPr>
                 <w:b/>
@@ -653,6 +663,7 @@
       </w:tr>
       <w:tr>
         <w:trPr>
+          <w:cantSplit/>
           <w:tblHeader w:val="off"/>
         </w:trPr>
         <w:tc>
@@ -672,6 +683,10 @@
             </w:tcMar>
           </w:tcPr>
           <w:p>
+            <w:pPr>
+              <w:keepNext/>
+              <w:keepLines/>
+            </w:pPr>
             <w:r>
               <w:t xml:space="preserve">Node.js 18, 20, or 22 and newer</w:t>
             </w:r>
@@ -694,6 +709,10 @@
             </w:tcMar>
           </w:tcPr>
           <w:p>
+            <w:pPr>
+              <w:keepNext/>
+              <w:keepLines/>
+            </w:pPr>
             <w:r>
               <w:rPr>
                 <w:rFonts w:ascii="Consolas" w:cs="Consolas" w:eastAsia="Consolas" w:hAnsi="Consolas"/>
@@ -711,6 +730,7 @@
       </w:tr>
       <w:tr>
         <w:trPr>
+          <w:cantSplit/>
           <w:tblHeader w:val="off"/>
         </w:trPr>
         <w:tc>
@@ -730,6 +750,10 @@
             </w:tcMar>
           </w:tcPr>
           <w:p>
+            <w:pPr>
+              <w:keepNext/>
+              <w:keepLines/>
+            </w:pPr>
             <w:r>
               <w:t xml:space="preserve">Internet on the first run</w:t>
             </w:r>
@@ -752,6 +776,10 @@
             </w:tcMar>
           </w:tcPr>
           <w:p>
+            <w:pPr>
+              <w:keepNext/>
+              <w:keepLines/>
+            </w:pPr>
             <w:r>
               <w:t xml:space="preserve">Only for </w:t>
             </w:r>
@@ -772,6 +800,7 @@
       </w:tr>
       <w:tr>
         <w:trPr>
+          <w:cantSplit/>
           <w:tblHeader w:val="off"/>
         </w:trPr>
         <w:tc>
@@ -791,6 +820,10 @@
             </w:tcMar>
           </w:tcPr>
           <w:p>
+            <w:pPr>
+              <w:keepNext/>
+              <w:keepLines/>
+            </w:pPr>
             <w:r>
               <w:t xml:space="preserve">The Exercise 3 server</w:t>
             </w:r>
@@ -813,6 +846,10 @@
             </w:tcMar>
           </w:tcPr>
           <w:p>
+            <w:pPr>
+              <w:keepNext/>
+              <w:keepLines/>
+            </w:pPr>
             <w:r>
               <w:t xml:space="preserve">Tomcat on </w:t>
             </w:r>
@@ -845,6 +882,7 @@
       </w:tr>
       <w:tr>
         <w:trPr>
+          <w:cantSplit/>
           <w:tblHeader w:val="off"/>
         </w:trPr>
         <w:tc>
@@ -864,6 +902,10 @@
             </w:tcMar>
           </w:tcPr>
           <w:p>
+            <w:pPr>
+              <w:keepNext w:val="false"/>
+              <w:keepLines/>
+            </w:pPr>
             <w:r>
               <w:t xml:space="preserve">Port 5173 free</w:t>
             </w:r>
@@ -886,6 +928,10 @@
             </w:tcMar>
           </w:tcPr>
           <w:p>
+            <w:pPr>
+              <w:keepNext w:val="false"/>
+              <w:keepLines/>
+            </w:pPr>
             <w:r>
               <w:t xml:space="preserve">The port the web client runs on.</w:t>
             </w:r>
@@ -895,6 +941,15 @@
     </w:tbl>
     <w:p>
       <w:pPr>
+        <w:pStyle w:val="Heading1"/>
+        <w:pageBreakBefore/>
+      </w:pPr>
+      <w:r>
+        <w:t xml:space="preserve">Using It and Troubleshooting</w:t>
+      </w:r>
+    </w:p>
+    <w:p>
+      <w:pPr>
         <w:pStyle w:val="Heading2"/>
       </w:pPr>
       <w:r>
@@ -903,6 +958,7 @@
     </w:p>
     <w:p>
       <w:pPr>
+        <w:keepLines/>
         <w:spacing w:after="120"/>
       </w:pPr>
       <w:r>
@@ -947,6 +1003,7 @@
       </w:tblGrid>
       <w:tr>
         <w:trPr>
+          <w:cantSplit/>
           <w:tblHeader/>
         </w:trPr>
         <w:tc>
@@ -967,6 +1024,10 @@
             </w:tcMar>
           </w:tcPr>
           <w:p>
+            <w:pPr>
+              <w:keepNext/>
+              <w:keepLines/>
+            </w:pPr>
             <w:r>
               <w:rPr>
                 <w:b/>
@@ -995,6 +1056,10 @@
             </w:tcMar>
           </w:tcPr>
           <w:p>
+            <w:pPr>
+              <w:keepNext/>
+              <w:keepLines/>
+            </w:pPr>
             <w:r>
               <w:rPr>
                 <w:b/>
@@ -1008,6 +1073,7 @@
       </w:tr>
       <w:tr>
         <w:trPr>
+          <w:cantSplit/>
           <w:tblHeader w:val="off"/>
         </w:trPr>
         <w:tc>
@@ -1027,6 +1093,10 @@
             </w:tcMar>
           </w:tcPr>
           <w:p>
+            <w:pPr>
+              <w:keepNext/>
+              <w:keepLines/>
+            </w:pPr>
             <w:r>
               <w:t xml:space="preserve">"Cannot reach the Guess Market server" / a red "Server unreachable" chip</w:t>
             </w:r>
@@ -1049,6 +1119,10 @@
             </w:tcMar>
           </w:tcPr>
           <w:p>
+            <w:pPr>
+              <w:keepNext/>
+              <w:keepLines/>
+            </w:pPr>
             <w:r>
               <w:t xml:space="preserve">Tomcat is not running, or </w:t>
             </w:r>
@@ -1069,6 +1143,7 @@
       </w:tr>
       <w:tr>
         <w:trPr>
+          <w:cantSplit/>
           <w:tblHeader w:val="off"/>
         </w:trPr>
         <w:tc>
@@ -1088,6 +1163,10 @@
             </w:tcMar>
           </w:tcPr>
           <w:p>
+            <w:pPr>
+              <w:keepNext/>
+              <w:keepLines/>
+            </w:pPr>
             <w:r>
               <w:rPr>
                 <w:rFonts w:ascii="Consolas" w:cs="Consolas" w:eastAsia="Consolas" w:hAnsi="Consolas"/>
@@ -1119,6 +1198,10 @@
             </w:tcMar>
           </w:tcPr>
           <w:p>
+            <w:pPr>
+              <w:keepNext/>
+              <w:keepLines/>
+            </w:pPr>
             <w:r>
               <w:t xml:space="preserve">Install the current LTS version from nodejs.org and run </w:t>
             </w:r>
@@ -1139,6 +1222,7 @@
       </w:tr>
       <w:tr>
         <w:trPr>
+          <w:cantSplit/>
           <w:tblHeader w:val="off"/>
         </w:trPr>
         <w:tc>
@@ -1158,6 +1242,10 @@
             </w:tcMar>
           </w:tcPr>
           <w:p>
+            <w:pPr>
+              <w:keepNext/>
+              <w:keepLines/>
+            </w:pPr>
             <w:r>
               <w:t xml:space="preserve">"Port 5173 is already in use"</w:t>
             </w:r>
@@ -1180,6 +1268,10 @@
             </w:tcMar>
           </w:tcPr>
           <w:p>
+            <w:pPr>
+              <w:keepNext/>
+              <w:keepLines/>
+            </w:pPr>
             <w:r>
               <w:t xml:space="preserve">Another copy of the web client is already running - close its window first.</w:t>
             </w:r>
@@ -1188,6 +1280,7 @@
       </w:tr>
       <w:tr>
         <w:trPr>
+          <w:cantSplit/>
           <w:tblHeader w:val="off"/>
         </w:trPr>
         <w:tc>
@@ -1207,6 +1300,10 @@
             </w:tcMar>
           </w:tcPr>
           <w:p>
+            <w:pPr>
+              <w:keepNext w:val="false"/>
+              <w:keepLines/>
+            </w:pPr>
             <w:r>
               <w:rPr>
                 <w:rFonts w:ascii="Consolas" w:cs="Consolas" w:eastAsia="Consolas" w:hAnsi="Consolas"/>
@@ -1238,6 +1335,10 @@
             </w:tcMar>
           </w:tcPr>
           <w:p>
+            <w:pPr>
+              <w:keepNext w:val="false"/>
+              <w:keepLines/>
+            </w:pPr>
             <w:r>
               <w:t xml:space="preserve">Check the internet connection and run </w:t>
             </w:r>
@@ -1260,6 +1361,7 @@
     <w:p>
       <w:pPr>
         <w:pStyle w:val="Heading1"/>
+        <w:pageBreakBefore/>
       </w:pPr>
       <w:r>
         <w:t xml:space="preserve">What the Web Client Includes</w:t>
@@ -1276,6 +1378,7 @@
     <w:p>
       <w:pPr>
         <w:pStyle w:val="ListParagraph"/>
+        <w:keepLines/>
         <w:numPr>
           <w:ilvl w:val="0"/>
           <w:numId w:val="3"/>
@@ -1296,6 +1399,7 @@
     <w:p>
       <w:pPr>
         <w:pStyle w:val="ListParagraph"/>
+        <w:keepLines/>
         <w:numPr>
           <w:ilvl w:val="0"/>
           <w:numId w:val="3"/>
@@ -1316,6 +1420,7 @@
     <w:p>
       <w:pPr>
         <w:pStyle w:val="ListParagraph"/>
+        <w:keepLines/>
         <w:numPr>
           <w:ilvl w:val="0"/>
           <w:numId w:val="3"/>
@@ -1343,6 +1448,7 @@
     </w:p>
     <w:p>
       <w:pPr>
+        <w:keepLines/>
         <w:spacing w:after="120"/>
       </w:pPr>
       <w:r>
@@ -1352,6 +1458,7 @@
     <w:p>
       <w:pPr>
         <w:pStyle w:val="ListParagraph"/>
+        <w:keepLines/>
         <w:numPr>
           <w:ilvl w:val="0"/>
           <w:numId w:val="3"/>
@@ -1372,6 +1479,7 @@
     <w:p>
       <w:pPr>
         <w:pStyle w:val="ListParagraph"/>
+        <w:keepLines/>
         <w:numPr>
           <w:ilvl w:val="0"/>
           <w:numId w:val="3"/>
@@ -1392,6 +1500,7 @@
     <w:p>
       <w:pPr>
         <w:pStyle w:val="Heading1"/>
+        <w:pageBreakBefore/>
       </w:pPr>
       <w:r>
         <w:t xml:space="preserve">How It Talks to the Server</w:t>
@@ -1399,6 +1508,7 @@
     </w:p>
     <w:p>
       <w:pPr>
+        <w:keepLines/>
         <w:spacing w:after="120"/>
       </w:pPr>
       <w:r>
@@ -1431,6 +1541,7 @@
     </w:p>
     <w:p>
       <w:pPr>
+        <w:keepLines/>
         <w:spacing w:after="120"/>
       </w:pPr>
       <w:r>
@@ -1487,18 +1598,20 @@
     </w:p>
     <w:p>
       <w:pPr>
-        <w:pStyle w:val="Heading2"/>
-      </w:pPr>
-      <w:r>
-        <w:t xml:space="preserve">Same API as the JavaFX Client</w:t>
-      </w:r>
-    </w:p>
-    <w:p>
-      <w:pPr>
+        <w:pStyle w:val="Heading1"/>
+        <w:pageBreakBefore/>
+      </w:pPr>
+      <w:r>
+        <w:t xml:space="preserve">Server API Reference</w:t>
+      </w:r>
+    </w:p>
+    <w:p>
+      <w:pPr>
+        <w:keepLines/>
         <w:spacing w:after="120"/>
       </w:pPr>
       <w:r>
-        <w:t xml:space="preserve">The web client uses exactly the endpoints the JavaFX client uses, with the same request bodies:</w:t>
+        <w:t xml:space="preserve">The web client calls exactly the same endpoints as the JavaFX client, with the same request bodies - every one of them listed below. The only Exercise 3 endpoint it does not use is file upload.</w:t>
       </w:r>
     </w:p>
     <w:tbl>
@@ -1514,17 +1627,19 @@
         </w:tblBorders>
       </w:tblPr>
       <w:tblGrid>
-        <w:gridCol w:w="1100"/>
-        <w:gridCol w:w="3100"/>
-        <w:gridCol w:w="4106"/>
+        <w:gridCol w:w="772"/>
+        <w:gridCol w:w="2276"/>
+        <w:gridCol w:w="3628"/>
+        <w:gridCol w:w="1630"/>
       </w:tblGrid>
       <w:tr>
         <w:trPr>
+          <w:cantSplit/>
           <w:tblHeader/>
         </w:trPr>
         <w:tc>
           <w:tcPr>
-            <w:tcW w:type="dxa" w:w="1100"/>
+            <w:tcW w:type="dxa" w:w="772"/>
             <w:tcBorders>
               <w:top w:val="single" w:color="D8DBE3" w:sz="6"/>
               <w:left w:val="single" w:color="D8DBE3" w:sz="6"/>
@@ -1540,6 +1655,10 @@
             </w:tcMar>
           </w:tcPr>
           <w:p>
+            <w:pPr>
+              <w:keepNext/>
+              <w:keepLines/>
+            </w:pPr>
             <w:r>
               <w:rPr>
                 <w:b/>
@@ -1552,7 +1671,7 @@
         </w:tc>
         <w:tc>
           <w:tcPr>
-            <w:tcW w:type="dxa" w:w="3100"/>
+            <w:tcW w:type="dxa" w:w="2276"/>
             <w:tcBorders>
               <w:top w:val="single" w:color="D8DBE3" w:sz="6"/>
               <w:left w:val="single" w:color="D8DBE3" w:sz="6"/>
@@ -1568,6 +1687,10 @@
             </w:tcMar>
           </w:tcPr>
           <w:p>
+            <w:pPr>
+              <w:keepNext/>
+              <w:keepLines/>
+            </w:pPr>
             <w:r>
               <w:rPr>
                 <w:b/>
@@ -1580,7 +1703,7 @@
         </w:tc>
         <w:tc>
           <w:tcPr>
-            <w:tcW w:type="dxa" w:w="4106"/>
+            <w:tcW w:type="dxa" w:w="3628"/>
             <w:tcBorders>
               <w:top w:val="single" w:color="D8DBE3" w:sz="6"/>
               <w:left w:val="single" w:color="D8DBE3" w:sz="6"/>
@@ -1596,12 +1719,48 @@
             </w:tcMar>
           </w:tcPr>
           <w:p>
+            <w:pPr>
+              <w:keepNext/>
+              <w:keepLines/>
+            </w:pPr>
             <w:r>
               <w:rPr>
                 <w:b/>
                 <w:bCs/>
                 <w:color w:val="FFFFFF"/>
               </w:rPr>
+              <w:t xml:space="preserve">Request Body</w:t>
+            </w:r>
+          </w:p>
+        </w:tc>
+        <w:tc>
+          <w:tcPr>
+            <w:tcW w:type="dxa" w:w="1630"/>
+            <w:tcBorders>
+              <w:top w:val="single" w:color="D8DBE3" w:sz="6"/>
+              <w:left w:val="single" w:color="D8DBE3" w:sz="6"/>
+              <w:bottom w:val="single" w:color="D8DBE3" w:sz="6"/>
+              <w:right w:val="single" w:color="D8DBE3" w:sz="6"/>
+            </w:tcBorders>
+            <w:shd w:fill="4C5FD5" w:color="auto" w:val="clear"/>
+            <w:tcMar>
+              <w:top w:type="dxa" w:w="70"/>
+              <w:left w:type="dxa" w:w="110"/>
+              <w:bottom w:type="dxa" w:w="70"/>
+              <w:right w:type="dxa" w:w="110"/>
+            </w:tcMar>
+          </w:tcPr>
+          <w:p>
+            <w:pPr>
+              <w:keepNext/>
+              <w:keepLines/>
+            </w:pPr>
+            <w:r>
+              <w:rPr>
+                <w:b/>
+                <w:bCs/>
+                <w:color w:val="FFFFFF"/>
+              </w:rPr>
               <w:t xml:space="preserve">Used for</w:t>
             </w:r>
           </w:p>
@@ -1609,53 +1768,66 @@
       </w:tr>
       <w:tr>
         <w:trPr>
+          <w:cantSplit/>
           <w:tblHeader w:val="off"/>
         </w:trPr>
         <w:tc>
           <w:tcPr>
-            <w:tcW w:type="dxa" w:w="1100"/>
-            <w:tcBorders>
-              <w:top w:val="single" w:color="D8DBE3" w:sz="6"/>
-              <w:left w:val="single" w:color="D8DBE3" w:sz="6"/>
-              <w:bottom w:val="single" w:color="D8DBE3" w:sz="6"/>
-              <w:right w:val="single" w:color="D8DBE3" w:sz="6"/>
-            </w:tcBorders>
-            <w:tcMar>
-              <w:top w:type="dxa" w:w="70"/>
-              <w:left w:type="dxa" w:w="110"/>
-              <w:bottom w:type="dxa" w:w="70"/>
-              <w:right w:type="dxa" w:w="110"/>
-            </w:tcMar>
-          </w:tcPr>
-          <w:p>
-            <w:r>
+            <w:tcW w:type="dxa" w:w="772"/>
+            <w:tcBorders>
+              <w:top w:val="single" w:color="D8DBE3" w:sz="6"/>
+              <w:left w:val="single" w:color="D8DBE3" w:sz="6"/>
+              <w:bottom w:val="single" w:color="D8DBE3" w:sz="6"/>
+              <w:right w:val="single" w:color="D8DBE3" w:sz="6"/>
+            </w:tcBorders>
+            <w:tcMar>
+              <w:top w:type="dxa" w:w="70"/>
+              <w:left w:type="dxa" w:w="110"/>
+              <w:bottom w:type="dxa" w:w="70"/>
+              <w:right w:type="dxa" w:w="110"/>
+            </w:tcMar>
+          </w:tcPr>
+          <w:p>
+            <w:pPr>
+              <w:keepNext/>
+              <w:keepLines/>
+            </w:pPr>
+            <w:r>
+              <w:rPr>
+                <w:sz w:val="17"/>
+                <w:szCs w:val="17"/>
+              </w:rPr>
               <w:t xml:space="preserve">POST</w:t>
             </w:r>
           </w:p>
         </w:tc>
         <w:tc>
           <w:tcPr>
-            <w:tcW w:type="dxa" w:w="3100"/>
-            <w:tcBorders>
-              <w:top w:val="single" w:color="D8DBE3" w:sz="6"/>
-              <w:left w:val="single" w:color="D8DBE3" w:sz="6"/>
-              <w:bottom w:val="single" w:color="D8DBE3" w:sz="6"/>
-              <w:right w:val="single" w:color="D8DBE3" w:sz="6"/>
-            </w:tcBorders>
-            <w:tcMar>
-              <w:top w:type="dxa" w:w="70"/>
-              <w:left w:type="dxa" w:w="110"/>
-              <w:bottom w:type="dxa" w:w="70"/>
-              <w:right w:type="dxa" w:w="110"/>
-            </w:tcMar>
-          </w:tcPr>
-          <w:p>
+            <w:tcW w:type="dxa" w:w="2276"/>
+            <w:tcBorders>
+              <w:top w:val="single" w:color="D8DBE3" w:sz="6"/>
+              <w:left w:val="single" w:color="D8DBE3" w:sz="6"/>
+              <w:bottom w:val="single" w:color="D8DBE3" w:sz="6"/>
+              <w:right w:val="single" w:color="D8DBE3" w:sz="6"/>
+            </w:tcBorders>
+            <w:tcMar>
+              <w:top w:type="dxa" w:w="70"/>
+              <w:left w:type="dxa" w:w="110"/>
+              <w:bottom w:type="dxa" w:w="70"/>
+              <w:right w:type="dxa" w:w="110"/>
+            </w:tcMar>
+          </w:tcPr>
+          <w:p>
+            <w:pPr>
+              <w:keepNext/>
+              <w:keepLines/>
+            </w:pPr>
             <w:r>
               <w:rPr>
                 <w:rFonts w:ascii="Consolas" w:cs="Consolas" w:eastAsia="Consolas" w:hAnsi="Consolas"/>
                 <w:color w:val="7C3AED"/>
-                <w:sz w:val="19"/>
-                <w:szCs w:val="19"/>
+                <w:sz w:val="17"/>
+                <w:szCs w:val="17"/>
               </w:rPr>
               <w:t xml:space="preserve">/users/register</w:t>
             </w:r>
@@ -1663,230 +1835,387 @@
         </w:tc>
         <w:tc>
           <w:tcPr>
-            <w:tcW w:type="dxa" w:w="4106"/>
-            <w:tcBorders>
-              <w:top w:val="single" w:color="D8DBE3" w:sz="6"/>
-              <w:left w:val="single" w:color="D8DBE3" w:sz="6"/>
-              <w:bottom w:val="single" w:color="D8DBE3" w:sz="6"/>
-              <w:right w:val="single" w:color="D8DBE3" w:sz="6"/>
-            </w:tcBorders>
-            <w:tcMar>
-              <w:top w:type="dxa" w:w="70"/>
-              <w:left w:type="dxa" w:w="110"/>
-              <w:bottom w:type="dxa" w:w="70"/>
-              <w:right w:type="dxa" w:w="110"/>
-            </w:tcMar>
-          </w:tcPr>
-          <w:p>
-            <w:r>
-              <w:t xml:space="preserve">Login</w:t>
+            <w:tcW w:type="dxa" w:w="3628"/>
+            <w:tcBorders>
+              <w:top w:val="single" w:color="D8DBE3" w:sz="6"/>
+              <w:left w:val="single" w:color="D8DBE3" w:sz="6"/>
+              <w:bottom w:val="single" w:color="D8DBE3" w:sz="6"/>
+              <w:right w:val="single" w:color="D8DBE3" w:sz="6"/>
+            </w:tcBorders>
+            <w:tcMar>
+              <w:top w:type="dxa" w:w="70"/>
+              <w:left w:type="dxa" w:w="110"/>
+              <w:bottom w:type="dxa" w:w="70"/>
+              <w:right w:type="dxa" w:w="110"/>
+            </w:tcMar>
+          </w:tcPr>
+          <w:p>
+            <w:pPr>
+              <w:keepNext/>
+              <w:keepLines/>
+            </w:pPr>
+            <w:r>
+              <w:rPr>
+                <w:rFonts w:ascii="Consolas" w:cs="Consolas" w:eastAsia="Consolas" w:hAnsi="Consolas"/>
+                <w:color w:val="7C3AED"/>
+                <w:sz w:val="17"/>
+                <w:szCs w:val="17"/>
+              </w:rPr>
+              <w:t xml:space="preserve">{"name": "alice"}</w:t>
+            </w:r>
+          </w:p>
+        </w:tc>
+        <w:tc>
+          <w:tcPr>
+            <w:tcW w:type="dxa" w:w="1630"/>
+            <w:tcBorders>
+              <w:top w:val="single" w:color="D8DBE3" w:sz="6"/>
+              <w:left w:val="single" w:color="D8DBE3" w:sz="6"/>
+              <w:bottom w:val="single" w:color="D8DBE3" w:sz="6"/>
+              <w:right w:val="single" w:color="D8DBE3" w:sz="6"/>
+            </w:tcBorders>
+            <w:tcMar>
+              <w:top w:type="dxa" w:w="70"/>
+              <w:left w:type="dxa" w:w="110"/>
+              <w:bottom w:type="dxa" w:w="70"/>
+              <w:right w:type="dxa" w:w="110"/>
+            </w:tcMar>
+          </w:tcPr>
+          <w:p>
+            <w:pPr>
+              <w:keepNext/>
+              <w:keepLines/>
+            </w:pPr>
+            <w:r>
+              <w:rPr>
+                <w:sz w:val="17"/>
+                <w:szCs w:val="17"/>
+              </w:rPr>
+              <w:t xml:space="preserve">Login.</w:t>
             </w:r>
           </w:p>
         </w:tc>
       </w:tr>
       <w:tr>
         <w:trPr>
+          <w:cantSplit/>
           <w:tblHeader w:val="off"/>
         </w:trPr>
         <w:tc>
           <w:tcPr>
-            <w:tcW w:type="dxa" w:w="1100"/>
-            <w:tcBorders>
-              <w:top w:val="single" w:color="D8DBE3" w:sz="6"/>
-              <w:left w:val="single" w:color="D8DBE3" w:sz="6"/>
-              <w:bottom w:val="single" w:color="D8DBE3" w:sz="6"/>
-              <w:right w:val="single" w:color="D8DBE3" w:sz="6"/>
-            </w:tcBorders>
-            <w:tcMar>
-              <w:top w:type="dxa" w:w="70"/>
-              <w:left w:type="dxa" w:w="110"/>
-              <w:bottom w:type="dxa" w:w="70"/>
-              <w:right w:type="dxa" w:w="110"/>
-            </w:tcMar>
-          </w:tcPr>
-          <w:p>
-            <w:r>
-              <w:t xml:space="preserve">GET</w:t>
-            </w:r>
-          </w:p>
-        </w:tc>
-        <w:tc>
-          <w:tcPr>
-            <w:tcW w:type="dxa" w:w="3100"/>
-            <w:tcBorders>
-              <w:top w:val="single" w:color="D8DBE3" w:sz="6"/>
-              <w:left w:val="single" w:color="D8DBE3" w:sz="6"/>
-              <w:bottom w:val="single" w:color="D8DBE3" w:sz="6"/>
-              <w:right w:val="single" w:color="D8DBE3" w:sz="6"/>
-            </w:tcBorders>
-            <w:tcMar>
-              <w:top w:type="dxa" w:w="70"/>
-              <w:left w:type="dxa" w:w="110"/>
-              <w:bottom w:type="dxa" w:w="70"/>
-              <w:right w:type="dxa" w:w="110"/>
-            </w:tcMar>
-          </w:tcPr>
-          <w:p>
+            <w:tcW w:type="dxa" w:w="772"/>
+            <w:tcBorders>
+              <w:top w:val="single" w:color="D8DBE3" w:sz="6"/>
+              <w:left w:val="single" w:color="D8DBE3" w:sz="6"/>
+              <w:bottom w:val="single" w:color="D8DBE3" w:sz="6"/>
+              <w:right w:val="single" w:color="D8DBE3" w:sz="6"/>
+            </w:tcBorders>
+            <w:tcMar>
+              <w:top w:type="dxa" w:w="70"/>
+              <w:left w:type="dxa" w:w="110"/>
+              <w:bottom w:type="dxa" w:w="70"/>
+              <w:right w:type="dxa" w:w="110"/>
+            </w:tcMar>
+          </w:tcPr>
+          <w:p>
+            <w:pPr>
+              <w:keepNext/>
+              <w:keepLines/>
+            </w:pPr>
+            <w:r>
+              <w:rPr>
+                <w:sz w:val="17"/>
+                <w:szCs w:val="17"/>
+              </w:rPr>
+              <w:t xml:space="preserve">POST</w:t>
+            </w:r>
+          </w:p>
+        </w:tc>
+        <w:tc>
+          <w:tcPr>
+            <w:tcW w:type="dxa" w:w="2276"/>
+            <w:tcBorders>
+              <w:top w:val="single" w:color="D8DBE3" w:sz="6"/>
+              <w:left w:val="single" w:color="D8DBE3" w:sz="6"/>
+              <w:bottom w:val="single" w:color="D8DBE3" w:sz="6"/>
+              <w:right w:val="single" w:color="D8DBE3" w:sz="6"/>
+            </w:tcBorders>
+            <w:tcMar>
+              <w:top w:type="dxa" w:w="70"/>
+              <w:left w:type="dxa" w:w="110"/>
+              <w:bottom w:type="dxa" w:w="70"/>
+              <w:right w:type="dxa" w:w="110"/>
+            </w:tcMar>
+          </w:tcPr>
+          <w:p>
+            <w:pPr>
+              <w:keepNext/>
+              <w:keepLines/>
+            </w:pPr>
             <w:r>
               <w:rPr>
                 <w:rFonts w:ascii="Consolas" w:cs="Consolas" w:eastAsia="Consolas" w:hAnsi="Consolas"/>
                 <w:color w:val="7C3AED"/>
-                <w:sz w:val="19"/>
-                <w:szCs w:val="19"/>
-              </w:rPr>
-              <w:t xml:space="preserve">/users</w:t>
-            </w:r>
-          </w:p>
-        </w:tc>
-        <w:tc>
-          <w:tcPr>
-            <w:tcW w:type="dxa" w:w="4106"/>
-            <w:tcBorders>
-              <w:top w:val="single" w:color="D8DBE3" w:sz="6"/>
-              <w:left w:val="single" w:color="D8DBE3" w:sz="6"/>
-              <w:bottom w:val="single" w:color="D8DBE3" w:sz="6"/>
-              <w:right w:val="single" w:color="D8DBE3" w:sz="6"/>
-            </w:tcBorders>
-            <w:tcMar>
-              <w:top w:type="dxa" w:w="70"/>
-              <w:left w:type="dxa" w:w="110"/>
-              <w:bottom w:type="dxa" w:w="70"/>
-              <w:right w:type="dxa" w:w="110"/>
-            </w:tcMar>
-          </w:tcPr>
-          <w:p>
-            <w:r>
-              <w:t xml:space="preserve">Users list, balances, account history</w:t>
+                <w:sz w:val="17"/>
+                <w:szCs w:val="17"/>
+              </w:rPr>
+              <w:t xml:space="preserve">/users/deposit</w:t>
+            </w:r>
+          </w:p>
+        </w:tc>
+        <w:tc>
+          <w:tcPr>
+            <w:tcW w:type="dxa" w:w="3628"/>
+            <w:tcBorders>
+              <w:top w:val="single" w:color="D8DBE3" w:sz="6"/>
+              <w:left w:val="single" w:color="D8DBE3" w:sz="6"/>
+              <w:bottom w:val="single" w:color="D8DBE3" w:sz="6"/>
+              <w:right w:val="single" w:color="D8DBE3" w:sz="6"/>
+            </w:tcBorders>
+            <w:tcMar>
+              <w:top w:type="dxa" w:w="70"/>
+              <w:left w:type="dxa" w:w="110"/>
+              <w:bottom w:type="dxa" w:w="70"/>
+              <w:right w:type="dxa" w:w="110"/>
+            </w:tcMar>
+          </w:tcPr>
+          <w:p>
+            <w:pPr>
+              <w:keepNext/>
+              <w:keepLines/>
+            </w:pPr>
+            <w:r>
+              <w:rPr>
+                <w:rFonts w:ascii="Consolas" w:cs="Consolas" w:eastAsia="Consolas" w:hAnsi="Consolas"/>
+                <w:color w:val="7C3AED"/>
+                <w:sz w:val="17"/>
+                <w:szCs w:val="17"/>
+              </w:rPr>
+              <w:t xml:space="preserve">{"userName": "alice", "amount": 100}</w:t>
+            </w:r>
+          </w:p>
+        </w:tc>
+        <w:tc>
+          <w:tcPr>
+            <w:tcW w:type="dxa" w:w="1630"/>
+            <w:tcBorders>
+              <w:top w:val="single" w:color="D8DBE3" w:sz="6"/>
+              <w:left w:val="single" w:color="D8DBE3" w:sz="6"/>
+              <w:bottom w:val="single" w:color="D8DBE3" w:sz="6"/>
+              <w:right w:val="single" w:color="D8DBE3" w:sz="6"/>
+            </w:tcBorders>
+            <w:tcMar>
+              <w:top w:type="dxa" w:w="70"/>
+              <w:left w:type="dxa" w:w="110"/>
+              <w:bottom w:type="dxa" w:w="70"/>
+              <w:right w:type="dxa" w:w="110"/>
+            </w:tcMar>
+          </w:tcPr>
+          <w:p>
+            <w:pPr>
+              <w:keepNext/>
+              <w:keepLines/>
+            </w:pPr>
+            <w:r>
+              <w:rPr>
+                <w:sz w:val="17"/>
+                <w:szCs w:val="17"/>
+              </w:rPr>
+              <w:t xml:space="preserve">Deposit.</w:t>
             </w:r>
           </w:p>
         </w:tc>
       </w:tr>
       <w:tr>
         <w:trPr>
+          <w:cantSplit/>
           <w:tblHeader w:val="off"/>
         </w:trPr>
         <w:tc>
           <w:tcPr>
-            <w:tcW w:type="dxa" w:w="1100"/>
-            <w:tcBorders>
-              <w:top w:val="single" w:color="D8DBE3" w:sz="6"/>
-              <w:left w:val="single" w:color="D8DBE3" w:sz="6"/>
-              <w:bottom w:val="single" w:color="D8DBE3" w:sz="6"/>
-              <w:right w:val="single" w:color="D8DBE3" w:sz="6"/>
-            </w:tcBorders>
-            <w:tcMar>
-              <w:top w:type="dxa" w:w="70"/>
-              <w:left w:type="dxa" w:w="110"/>
-              <w:bottom w:type="dxa" w:w="70"/>
-              <w:right w:type="dxa" w:w="110"/>
-            </w:tcMar>
-          </w:tcPr>
-          <w:p>
-            <w:r>
-              <w:t xml:space="preserve">POST</w:t>
-            </w:r>
-          </w:p>
-        </w:tc>
-        <w:tc>
-          <w:tcPr>
-            <w:tcW w:type="dxa" w:w="3100"/>
-            <w:tcBorders>
-              <w:top w:val="single" w:color="D8DBE3" w:sz="6"/>
-              <w:left w:val="single" w:color="D8DBE3" w:sz="6"/>
-              <w:bottom w:val="single" w:color="D8DBE3" w:sz="6"/>
-              <w:right w:val="single" w:color="D8DBE3" w:sz="6"/>
-            </w:tcBorders>
-            <w:tcMar>
-              <w:top w:type="dxa" w:w="70"/>
-              <w:left w:type="dxa" w:w="110"/>
-              <w:bottom w:type="dxa" w:w="70"/>
-              <w:right w:type="dxa" w:w="110"/>
-            </w:tcMar>
-          </w:tcPr>
-          <w:p>
+            <w:tcW w:type="dxa" w:w="772"/>
+            <w:tcBorders>
+              <w:top w:val="single" w:color="D8DBE3" w:sz="6"/>
+              <w:left w:val="single" w:color="D8DBE3" w:sz="6"/>
+              <w:bottom w:val="single" w:color="D8DBE3" w:sz="6"/>
+              <w:right w:val="single" w:color="D8DBE3" w:sz="6"/>
+            </w:tcBorders>
+            <w:tcMar>
+              <w:top w:type="dxa" w:w="70"/>
+              <w:left w:type="dxa" w:w="110"/>
+              <w:bottom w:type="dxa" w:w="70"/>
+              <w:right w:type="dxa" w:w="110"/>
+            </w:tcMar>
+          </w:tcPr>
+          <w:p>
+            <w:pPr>
+              <w:keepNext/>
+              <w:keepLines/>
+            </w:pPr>
+            <w:r>
+              <w:rPr>
+                <w:sz w:val="17"/>
+                <w:szCs w:val="17"/>
+              </w:rPr>
+              <w:t xml:space="preserve">GET</w:t>
+            </w:r>
+          </w:p>
+        </w:tc>
+        <w:tc>
+          <w:tcPr>
+            <w:tcW w:type="dxa" w:w="2276"/>
+            <w:tcBorders>
+              <w:top w:val="single" w:color="D8DBE3" w:sz="6"/>
+              <w:left w:val="single" w:color="D8DBE3" w:sz="6"/>
+              <w:bottom w:val="single" w:color="D8DBE3" w:sz="6"/>
+              <w:right w:val="single" w:color="D8DBE3" w:sz="6"/>
+            </w:tcBorders>
+            <w:tcMar>
+              <w:top w:type="dxa" w:w="70"/>
+              <w:left w:type="dxa" w:w="110"/>
+              <w:bottom w:type="dxa" w:w="70"/>
+              <w:right w:type="dxa" w:w="110"/>
+            </w:tcMar>
+          </w:tcPr>
+          <w:p>
+            <w:pPr>
+              <w:keepNext/>
+              <w:keepLines/>
+            </w:pPr>
             <w:r>
               <w:rPr>
                 <w:rFonts w:ascii="Consolas" w:cs="Consolas" w:eastAsia="Consolas" w:hAnsi="Consolas"/>
                 <w:color w:val="7C3AED"/>
-                <w:sz w:val="19"/>
-                <w:szCs w:val="19"/>
-              </w:rPr>
-              <w:t xml:space="preserve">/users/deposit</w:t>
-            </w:r>
-          </w:p>
-        </w:tc>
-        <w:tc>
-          <w:tcPr>
-            <w:tcW w:type="dxa" w:w="4106"/>
-            <w:tcBorders>
-              <w:top w:val="single" w:color="D8DBE3" w:sz="6"/>
-              <w:left w:val="single" w:color="D8DBE3" w:sz="6"/>
-              <w:bottom w:val="single" w:color="D8DBE3" w:sz="6"/>
-              <w:right w:val="single" w:color="D8DBE3" w:sz="6"/>
-            </w:tcBorders>
-            <w:tcMar>
-              <w:top w:type="dxa" w:w="70"/>
-              <w:left w:type="dxa" w:w="110"/>
-              <w:bottom w:type="dxa" w:w="70"/>
-              <w:right w:type="dxa" w:w="110"/>
-            </w:tcMar>
-          </w:tcPr>
-          <w:p>
-            <w:r>
-              <w:t xml:space="preserve">Deposit</w:t>
+                <w:sz w:val="17"/>
+                <w:szCs w:val="17"/>
+              </w:rPr>
+              <w:t xml:space="preserve">/users</w:t>
+            </w:r>
+          </w:p>
+        </w:tc>
+        <w:tc>
+          <w:tcPr>
+            <w:tcW w:type="dxa" w:w="3628"/>
+            <w:tcBorders>
+              <w:top w:val="single" w:color="D8DBE3" w:sz="6"/>
+              <w:left w:val="single" w:color="D8DBE3" w:sz="6"/>
+              <w:bottom w:val="single" w:color="D8DBE3" w:sz="6"/>
+              <w:right w:val="single" w:color="D8DBE3" w:sz="6"/>
+            </w:tcBorders>
+            <w:tcMar>
+              <w:top w:type="dxa" w:w="70"/>
+              <w:left w:type="dxa" w:w="110"/>
+              <w:bottom w:type="dxa" w:w="70"/>
+              <w:right w:type="dxa" w:w="110"/>
+            </w:tcMar>
+          </w:tcPr>
+          <w:p>
+            <w:pPr>
+              <w:keepNext/>
+              <w:keepLines/>
+            </w:pPr>
+            <w:r>
+              <w:rPr>
+                <w:sz w:val="17"/>
+                <w:szCs w:val="17"/>
+              </w:rPr>
+              <w:t xml:space="preserve">-</w:t>
+            </w:r>
+          </w:p>
+        </w:tc>
+        <w:tc>
+          <w:tcPr>
+            <w:tcW w:type="dxa" w:w="1630"/>
+            <w:tcBorders>
+              <w:top w:val="single" w:color="D8DBE3" w:sz="6"/>
+              <w:left w:val="single" w:color="D8DBE3" w:sz="6"/>
+              <w:bottom w:val="single" w:color="D8DBE3" w:sz="6"/>
+              <w:right w:val="single" w:color="D8DBE3" w:sz="6"/>
+            </w:tcBorders>
+            <w:tcMar>
+              <w:top w:type="dxa" w:w="70"/>
+              <w:left w:type="dxa" w:w="110"/>
+              <w:bottom w:type="dxa" w:w="70"/>
+              <w:right w:type="dxa" w:w="110"/>
+            </w:tcMar>
+          </w:tcPr>
+          <w:p>
+            <w:pPr>
+              <w:keepNext/>
+              <w:keepLines/>
+            </w:pPr>
+            <w:r>
+              <w:rPr>
+                <w:sz w:val="17"/>
+                <w:szCs w:val="17"/>
+              </w:rPr>
+              <w:t xml:space="preserve">Users list, balances, account history.</w:t>
             </w:r>
           </w:p>
         </w:tc>
       </w:tr>
       <w:tr>
         <w:trPr>
+          <w:cantSplit/>
           <w:tblHeader w:val="off"/>
         </w:trPr>
         <w:tc>
           <w:tcPr>
-            <w:tcW w:type="dxa" w:w="1100"/>
-            <w:tcBorders>
-              <w:top w:val="single" w:color="D8DBE3" w:sz="6"/>
-              <w:left w:val="single" w:color="D8DBE3" w:sz="6"/>
-              <w:bottom w:val="single" w:color="D8DBE3" w:sz="6"/>
-              <w:right w:val="single" w:color="D8DBE3" w:sz="6"/>
-            </w:tcBorders>
-            <w:tcMar>
-              <w:top w:type="dxa" w:w="70"/>
-              <w:left w:type="dxa" w:w="110"/>
-              <w:bottom w:type="dxa" w:w="70"/>
-              <w:right w:type="dxa" w:w="110"/>
-            </w:tcMar>
-          </w:tcPr>
-          <w:p>
-            <w:r>
+            <w:tcW w:type="dxa" w:w="772"/>
+            <w:tcBorders>
+              <w:top w:val="single" w:color="D8DBE3" w:sz="6"/>
+              <w:left w:val="single" w:color="D8DBE3" w:sz="6"/>
+              <w:bottom w:val="single" w:color="D8DBE3" w:sz="6"/>
+              <w:right w:val="single" w:color="D8DBE3" w:sz="6"/>
+            </w:tcBorders>
+            <w:tcMar>
+              <w:top w:type="dxa" w:w="70"/>
+              <w:left w:type="dxa" w:w="110"/>
+              <w:bottom w:type="dxa" w:w="70"/>
+              <w:right w:type="dxa" w:w="110"/>
+            </w:tcMar>
+          </w:tcPr>
+          <w:p>
+            <w:pPr>
+              <w:keepNext/>
+              <w:keepLines/>
+            </w:pPr>
+            <w:r>
+              <w:rPr>
+                <w:sz w:val="17"/>
+                <w:szCs w:val="17"/>
+              </w:rPr>
               <w:t xml:space="preserve">GET</w:t>
             </w:r>
           </w:p>
         </w:tc>
         <w:tc>
           <w:tcPr>
-            <w:tcW w:type="dxa" w:w="3100"/>
-            <w:tcBorders>
-              <w:top w:val="single" w:color="D8DBE3" w:sz="6"/>
-              <w:left w:val="single" w:color="D8DBE3" w:sz="6"/>
-              <w:bottom w:val="single" w:color="D8DBE3" w:sz="6"/>
-              <w:right w:val="single" w:color="D8DBE3" w:sz="6"/>
-            </w:tcBorders>
-            <w:tcMar>
-              <w:top w:type="dxa" w:w="70"/>
-              <w:left w:type="dxa" w:w="110"/>
-              <w:bottom w:type="dxa" w:w="70"/>
-              <w:right w:type="dxa" w:w="110"/>
-            </w:tcMar>
-          </w:tcPr>
-          <w:p>
+            <w:tcW w:type="dxa" w:w="2276"/>
+            <w:tcBorders>
+              <w:top w:val="single" w:color="D8DBE3" w:sz="6"/>
+              <w:left w:val="single" w:color="D8DBE3" w:sz="6"/>
+              <w:bottom w:val="single" w:color="D8DBE3" w:sz="6"/>
+              <w:right w:val="single" w:color="D8DBE3" w:sz="6"/>
+            </w:tcBorders>
+            <w:tcMar>
+              <w:top w:type="dxa" w:w="70"/>
+              <w:left w:type="dxa" w:w="110"/>
+              <w:bottom w:type="dxa" w:w="70"/>
+              <w:right w:type="dxa" w:w="110"/>
+            </w:tcMar>
+          </w:tcPr>
+          <w:p>
+            <w:pPr>
+              <w:keepNext/>
+              <w:keepLines/>
+            </w:pPr>
             <w:r>
               <w:rPr>
                 <w:rFonts w:ascii="Consolas" w:cs="Consolas" w:eastAsia="Consolas" w:hAnsi="Consolas"/>
                 <w:color w:val="7C3AED"/>
-                <w:sz w:val="19"/>
-                <w:szCs w:val="19"/>
+                <w:sz w:val="17"/>
+                <w:szCs w:val="17"/>
               </w:rPr>
               <w:t xml:space="preserve">/events</w:t>
             </w:r>
@@ -1894,485 +2223,1035 @@
         </w:tc>
         <w:tc>
           <w:tcPr>
-            <w:tcW w:type="dxa" w:w="4106"/>
-            <w:tcBorders>
-              <w:top w:val="single" w:color="D8DBE3" w:sz="6"/>
-              <w:left w:val="single" w:color="D8DBE3" w:sz="6"/>
-              <w:bottom w:val="single" w:color="D8DBE3" w:sz="6"/>
-              <w:right w:val="single" w:color="D8DBE3" w:sz="6"/>
-            </w:tcBorders>
-            <w:tcMar>
-              <w:top w:type="dxa" w:w="70"/>
-              <w:left w:type="dxa" w:w="110"/>
-              <w:bottom w:type="dxa" w:w="70"/>
-              <w:right w:type="dxa" w:w="110"/>
-            </w:tcMar>
-          </w:tcPr>
-          <w:p>
-            <w:r>
-              <w:t xml:space="preserve">Event list</w:t>
+            <w:tcW w:type="dxa" w:w="3628"/>
+            <w:tcBorders>
+              <w:top w:val="single" w:color="D8DBE3" w:sz="6"/>
+              <w:left w:val="single" w:color="D8DBE3" w:sz="6"/>
+              <w:bottom w:val="single" w:color="D8DBE3" w:sz="6"/>
+              <w:right w:val="single" w:color="D8DBE3" w:sz="6"/>
+            </w:tcBorders>
+            <w:tcMar>
+              <w:top w:type="dxa" w:w="70"/>
+              <w:left w:type="dxa" w:w="110"/>
+              <w:bottom w:type="dxa" w:w="70"/>
+              <w:right w:type="dxa" w:w="110"/>
+            </w:tcMar>
+          </w:tcPr>
+          <w:p>
+            <w:pPr>
+              <w:keepNext/>
+              <w:keepLines/>
+            </w:pPr>
+            <w:r>
+              <w:rPr>
+                <w:sz w:val="17"/>
+                <w:szCs w:val="17"/>
+              </w:rPr>
+              <w:t xml:space="preserve">-</w:t>
+            </w:r>
+          </w:p>
+        </w:tc>
+        <w:tc>
+          <w:tcPr>
+            <w:tcW w:type="dxa" w:w="1630"/>
+            <w:tcBorders>
+              <w:top w:val="single" w:color="D8DBE3" w:sz="6"/>
+              <w:left w:val="single" w:color="D8DBE3" w:sz="6"/>
+              <w:bottom w:val="single" w:color="D8DBE3" w:sz="6"/>
+              <w:right w:val="single" w:color="D8DBE3" w:sz="6"/>
+            </w:tcBorders>
+            <w:tcMar>
+              <w:top w:type="dxa" w:w="70"/>
+              <w:left w:type="dxa" w:w="110"/>
+              <w:bottom w:type="dxa" w:w="70"/>
+              <w:right w:type="dxa" w:w="110"/>
+            </w:tcMar>
+          </w:tcPr>
+          <w:p>
+            <w:pPr>
+              <w:keepNext/>
+              <w:keepLines/>
+            </w:pPr>
+            <w:r>
+              <w:rPr>
+                <w:sz w:val="17"/>
+                <w:szCs w:val="17"/>
+              </w:rPr>
+              <w:t xml:space="preserve">Event list.</w:t>
             </w:r>
           </w:p>
         </w:tc>
       </w:tr>
       <w:tr>
         <w:trPr>
+          <w:cantSplit/>
           <w:tblHeader w:val="off"/>
         </w:trPr>
         <w:tc>
           <w:tcPr>
-            <w:tcW w:type="dxa" w:w="1100"/>
-            <w:tcBorders>
-              <w:top w:val="single" w:color="D8DBE3" w:sz="6"/>
-              <w:left w:val="single" w:color="D8DBE3" w:sz="6"/>
-              <w:bottom w:val="single" w:color="D8DBE3" w:sz="6"/>
-              <w:right w:val="single" w:color="D8DBE3" w:sz="6"/>
-            </w:tcBorders>
-            <w:tcMar>
-              <w:top w:type="dxa" w:w="70"/>
-              <w:left w:type="dxa" w:w="110"/>
-              <w:bottom w:type="dxa" w:w="70"/>
-              <w:right w:type="dxa" w:w="110"/>
-            </w:tcMar>
-          </w:tcPr>
-          <w:p>
-            <w:r>
+            <w:tcW w:type="dxa" w:w="772"/>
+            <w:tcBorders>
+              <w:top w:val="single" w:color="D8DBE3" w:sz="6"/>
+              <w:left w:val="single" w:color="D8DBE3" w:sz="6"/>
+              <w:bottom w:val="single" w:color="D8DBE3" w:sz="6"/>
+              <w:right w:val="single" w:color="D8DBE3" w:sz="6"/>
+            </w:tcBorders>
+            <w:tcMar>
+              <w:top w:type="dxa" w:w="70"/>
+              <w:left w:type="dxa" w:w="110"/>
+              <w:bottom w:type="dxa" w:w="70"/>
+              <w:right w:type="dxa" w:w="110"/>
+            </w:tcMar>
+          </w:tcPr>
+          <w:p>
+            <w:pPr>
+              <w:keepNext/>
+              <w:keepLines/>
+            </w:pPr>
+            <w:r>
+              <w:rPr>
+                <w:sz w:val="17"/>
+                <w:szCs w:val="17"/>
+              </w:rPr>
               <w:t xml:space="preserve">GET</w:t>
             </w:r>
           </w:p>
         </w:tc>
         <w:tc>
           <w:tcPr>
-            <w:tcW w:type="dxa" w:w="3100"/>
-            <w:tcBorders>
-              <w:top w:val="single" w:color="D8DBE3" w:sz="6"/>
-              <w:left w:val="single" w:color="D8DBE3" w:sz="6"/>
-              <w:bottom w:val="single" w:color="D8DBE3" w:sz="6"/>
-              <w:right w:val="single" w:color="D8DBE3" w:sz="6"/>
-            </w:tcBorders>
-            <w:tcMar>
-              <w:top w:type="dxa" w:w="70"/>
-              <w:left w:type="dxa" w:w="110"/>
-              <w:bottom w:type="dxa" w:w="70"/>
-              <w:right w:type="dxa" w:w="110"/>
-            </w:tcMar>
-          </w:tcPr>
-          <w:p>
+            <w:tcW w:type="dxa" w:w="2276"/>
+            <w:tcBorders>
+              <w:top w:val="single" w:color="D8DBE3" w:sz="6"/>
+              <w:left w:val="single" w:color="D8DBE3" w:sz="6"/>
+              <w:bottom w:val="single" w:color="D8DBE3" w:sz="6"/>
+              <w:right w:val="single" w:color="D8DBE3" w:sz="6"/>
+            </w:tcBorders>
+            <w:tcMar>
+              <w:top w:type="dxa" w:w="70"/>
+              <w:left w:type="dxa" w:w="110"/>
+              <w:bottom w:type="dxa" w:w="70"/>
+              <w:right w:type="dxa" w:w="110"/>
+            </w:tcMar>
+          </w:tcPr>
+          <w:p>
+            <w:pPr>
+              <w:keepNext/>
+              <w:keepLines/>
+            </w:pPr>
             <w:r>
               <w:rPr>
                 <w:rFonts w:ascii="Consolas" w:cs="Consolas" w:eastAsia="Consolas" w:hAnsi="Consolas"/>
                 <w:color w:val="7C3AED"/>
-                <w:sz w:val="19"/>
-                <w:szCs w:val="19"/>
-              </w:rPr>
-              <w:t xml:space="preserve">/events?name=...</w:t>
-            </w:r>
-          </w:p>
-        </w:tc>
-        <w:tc>
-          <w:tcPr>
-            <w:tcW w:type="dxa" w:w="4106"/>
-            <w:tcBorders>
-              <w:top w:val="single" w:color="D8DBE3" w:sz="6"/>
-              <w:left w:val="single" w:color="D8DBE3" w:sz="6"/>
-              <w:bottom w:val="single" w:color="D8DBE3" w:sz="6"/>
-              <w:right w:val="single" w:color="D8DBE3" w:sz="6"/>
-            </w:tcBorders>
-            <w:tcMar>
-              <w:top w:type="dxa" w:w="70"/>
-              <w:left w:type="dxa" w:w="110"/>
-              <w:bottom w:type="dxa" w:w="70"/>
-              <w:right w:type="dxa" w:w="110"/>
-            </w:tcMar>
-          </w:tcPr>
-          <w:p>
-            <w:r>
-              <w:t xml:space="preserve">One event's full details</w:t>
+                <w:sz w:val="17"/>
+                <w:szCs w:val="17"/>
+              </w:rPr>
+              <w:t xml:space="preserve">/events?name=X</w:t>
+            </w:r>
+          </w:p>
+        </w:tc>
+        <w:tc>
+          <w:tcPr>
+            <w:tcW w:type="dxa" w:w="3628"/>
+            <w:tcBorders>
+              <w:top w:val="single" w:color="D8DBE3" w:sz="6"/>
+              <w:left w:val="single" w:color="D8DBE3" w:sz="6"/>
+              <w:bottom w:val="single" w:color="D8DBE3" w:sz="6"/>
+              <w:right w:val="single" w:color="D8DBE3" w:sz="6"/>
+            </w:tcBorders>
+            <w:tcMar>
+              <w:top w:type="dxa" w:w="70"/>
+              <w:left w:type="dxa" w:w="110"/>
+              <w:bottom w:type="dxa" w:w="70"/>
+              <w:right w:type="dxa" w:w="110"/>
+            </w:tcMar>
+          </w:tcPr>
+          <w:p>
+            <w:pPr>
+              <w:keepNext/>
+              <w:keepLines/>
+            </w:pPr>
+            <w:r>
+              <w:rPr>
+                <w:sz w:val="17"/>
+                <w:szCs w:val="17"/>
+              </w:rPr>
+              <w:t xml:space="preserve">-</w:t>
+            </w:r>
+          </w:p>
+        </w:tc>
+        <w:tc>
+          <w:tcPr>
+            <w:tcW w:type="dxa" w:w="1630"/>
+            <w:tcBorders>
+              <w:top w:val="single" w:color="D8DBE3" w:sz="6"/>
+              <w:left w:val="single" w:color="D8DBE3" w:sz="6"/>
+              <w:bottom w:val="single" w:color="D8DBE3" w:sz="6"/>
+              <w:right w:val="single" w:color="D8DBE3" w:sz="6"/>
+            </w:tcBorders>
+            <w:tcMar>
+              <w:top w:type="dxa" w:w="70"/>
+              <w:left w:type="dxa" w:w="110"/>
+              <w:bottom w:type="dxa" w:w="70"/>
+              <w:right w:type="dxa" w:w="110"/>
+            </w:tcMar>
+          </w:tcPr>
+          <w:p>
+            <w:pPr>
+              <w:keepNext/>
+              <w:keepLines/>
+            </w:pPr>
+            <w:r>
+              <w:rPr>
+                <w:sz w:val="17"/>
+                <w:szCs w:val="17"/>
+              </w:rPr>
+              <w:t xml:space="preserve">One event's full details.</w:t>
             </w:r>
           </w:p>
         </w:tc>
       </w:tr>
       <w:tr>
         <w:trPr>
+          <w:cantSplit/>
           <w:tblHeader w:val="off"/>
         </w:trPr>
         <w:tc>
           <w:tcPr>
-            <w:tcW w:type="dxa" w:w="1100"/>
-            <w:tcBorders>
-              <w:top w:val="single" w:color="D8DBE3" w:sz="6"/>
-              <w:left w:val="single" w:color="D8DBE3" w:sz="6"/>
-              <w:bottom w:val="single" w:color="D8DBE3" w:sz="6"/>
-              <w:right w:val="single" w:color="D8DBE3" w:sz="6"/>
-            </w:tcBorders>
-            <w:tcMar>
-              <w:top w:type="dxa" w:w="70"/>
-              <w:left w:type="dxa" w:w="110"/>
-              <w:bottom w:type="dxa" w:w="70"/>
-              <w:right w:type="dxa" w:w="110"/>
-            </w:tcMar>
-          </w:tcPr>
-          <w:p>
-            <w:r>
+            <w:tcW w:type="dxa" w:w="772"/>
+            <w:tcBorders>
+              <w:top w:val="single" w:color="D8DBE3" w:sz="6"/>
+              <w:left w:val="single" w:color="D8DBE3" w:sz="6"/>
+              <w:bottom w:val="single" w:color="D8DBE3" w:sz="6"/>
+              <w:right w:val="single" w:color="D8DBE3" w:sz="6"/>
+            </w:tcBorders>
+            <w:tcMar>
+              <w:top w:type="dxa" w:w="70"/>
+              <w:left w:type="dxa" w:w="110"/>
+              <w:bottom w:type="dxa" w:w="70"/>
+              <w:right w:type="dxa" w:w="110"/>
+            </w:tcMar>
+          </w:tcPr>
+          <w:p>
+            <w:pPr>
+              <w:keepNext/>
+              <w:keepLines/>
+            </w:pPr>
+            <w:r>
+              <w:rPr>
+                <w:sz w:val="17"/>
+                <w:szCs w:val="17"/>
+              </w:rPr>
               <w:t xml:space="preserve">POST</w:t>
             </w:r>
           </w:p>
         </w:tc>
         <w:tc>
           <w:tcPr>
-            <w:tcW w:type="dxa" w:w="3100"/>
-            <w:tcBorders>
-              <w:top w:val="single" w:color="D8DBE3" w:sz="6"/>
-              <w:left w:val="single" w:color="D8DBE3" w:sz="6"/>
-              <w:bottom w:val="single" w:color="D8DBE3" w:sz="6"/>
-              <w:right w:val="single" w:color="D8DBE3" w:sz="6"/>
-            </w:tcBorders>
-            <w:tcMar>
-              <w:top w:type="dxa" w:w="70"/>
-              <w:left w:type="dxa" w:w="110"/>
-              <w:bottom w:type="dxa" w:w="70"/>
-              <w:right w:type="dxa" w:w="110"/>
-            </w:tcMar>
-          </w:tcPr>
-          <w:p>
+            <w:tcW w:type="dxa" w:w="2276"/>
+            <w:tcBorders>
+              <w:top w:val="single" w:color="D8DBE3" w:sz="6"/>
+              <w:left w:val="single" w:color="D8DBE3" w:sz="6"/>
+              <w:bottom w:val="single" w:color="D8DBE3" w:sz="6"/>
+              <w:right w:val="single" w:color="D8DBE3" w:sz="6"/>
+            </w:tcBorders>
+            <w:tcMar>
+              <w:top w:type="dxa" w:w="70"/>
+              <w:left w:type="dxa" w:w="110"/>
+              <w:bottom w:type="dxa" w:w="70"/>
+              <w:right w:type="dxa" w:w="110"/>
+            </w:tcMar>
+          </w:tcPr>
+          <w:p>
+            <w:pPr>
+              <w:keepNext/>
+              <w:keepLines/>
+            </w:pPr>
             <w:r>
               <w:rPr>
                 <w:rFonts w:ascii="Consolas" w:cs="Consolas" w:eastAsia="Consolas" w:hAnsi="Consolas"/>
                 <w:color w:val="7C3AED"/>
-                <w:sz w:val="19"/>
-                <w:szCs w:val="19"/>
-              </w:rPr>
-              <w:t xml:space="preserve">/events/buy</w:t>
-            </w:r>
-          </w:p>
-        </w:tc>
-        <w:tc>
-          <w:tcPr>
-            <w:tcW w:type="dxa" w:w="4106"/>
-            <w:tcBorders>
-              <w:top w:val="single" w:color="D8DBE3" w:sz="6"/>
-              <w:left w:val="single" w:color="D8DBE3" w:sz="6"/>
-              <w:bottom w:val="single" w:color="D8DBE3" w:sz="6"/>
-              <w:right w:val="single" w:color="D8DBE3" w:sz="6"/>
-            </w:tcBorders>
-            <w:tcMar>
-              <w:top w:type="dxa" w:w="70"/>
-              <w:left w:type="dxa" w:w="110"/>
-              <w:bottom w:type="dxa" w:w="70"/>
-              <w:right w:type="dxa" w:w="110"/>
-            </w:tcMar>
-          </w:tcPr>
-          <w:p>
-            <w:r>
-              <w:t xml:space="preserve">LMSR purchase</w:t>
+                <w:sz w:val="17"/>
+                <w:szCs w:val="17"/>
+              </w:rPr>
+              <w:t xml:space="preserve">/events/open</w:t>
+            </w:r>
+          </w:p>
+        </w:tc>
+        <w:tc>
+          <w:tcPr>
+            <w:tcW w:type="dxa" w:w="3628"/>
+            <w:tcBorders>
+              <w:top w:val="single" w:color="D8DBE3" w:sz="6"/>
+              <w:left w:val="single" w:color="D8DBE3" w:sz="6"/>
+              <w:bottom w:val="single" w:color="D8DBE3" w:sz="6"/>
+              <w:right w:val="single" w:color="D8DBE3" w:sz="6"/>
+            </w:tcBorders>
+            <w:tcMar>
+              <w:top w:type="dxa" w:w="70"/>
+              <w:left w:type="dxa" w:w="110"/>
+              <w:bottom w:type="dxa" w:w="70"/>
+              <w:right w:type="dxa" w:w="110"/>
+            </w:tcMar>
+          </w:tcPr>
+          <w:p>
+            <w:pPr>
+              <w:keepNext/>
+              <w:keepLines/>
+            </w:pPr>
+            <w:r>
+              <w:rPr>
+                <w:rFonts w:ascii="Consolas" w:cs="Consolas" w:eastAsia="Consolas" w:hAnsi="Consolas"/>
+                <w:color w:val="7C3AED"/>
+                <w:sz w:val="17"/>
+                <w:szCs w:val="17"/>
+              </w:rPr>
+              <w:t xml:space="preserve">{"mmName": "alice", "eventName": "X"}</w:t>
+            </w:r>
+          </w:p>
+        </w:tc>
+        <w:tc>
+          <w:tcPr>
+            <w:tcW w:type="dxa" w:w="1630"/>
+            <w:tcBorders>
+              <w:top w:val="single" w:color="D8DBE3" w:sz="6"/>
+              <w:left w:val="single" w:color="D8DBE3" w:sz="6"/>
+              <w:bottom w:val="single" w:color="D8DBE3" w:sz="6"/>
+              <w:right w:val="single" w:color="D8DBE3" w:sz="6"/>
+            </w:tcBorders>
+            <w:tcMar>
+              <w:top w:type="dxa" w:w="70"/>
+              <w:left w:type="dxa" w:w="110"/>
+              <w:bottom w:type="dxa" w:w="70"/>
+              <w:right w:type="dxa" w:w="110"/>
+            </w:tcMar>
+          </w:tcPr>
+          <w:p>
+            <w:pPr>
+              <w:keepNext/>
+              <w:keepLines/>
+            </w:pPr>
+            <w:r>
+              <w:rPr>
+                <w:sz w:val="17"/>
+                <w:szCs w:val="17"/>
+              </w:rPr>
+              <w:t xml:space="preserve">MM opens the event.</w:t>
             </w:r>
           </w:p>
         </w:tc>
       </w:tr>
       <w:tr>
         <w:trPr>
+          <w:cantSplit/>
           <w:tblHeader w:val="off"/>
         </w:trPr>
         <w:tc>
           <w:tcPr>
-            <w:tcW w:type="dxa" w:w="1100"/>
-            <w:tcBorders>
-              <w:top w:val="single" w:color="D8DBE3" w:sz="6"/>
-              <w:left w:val="single" w:color="D8DBE3" w:sz="6"/>
-              <w:bottom w:val="single" w:color="D8DBE3" w:sz="6"/>
-              <w:right w:val="single" w:color="D8DBE3" w:sz="6"/>
-            </w:tcBorders>
-            <w:tcMar>
-              <w:top w:type="dxa" w:w="70"/>
-              <w:left w:type="dxa" w:w="110"/>
-              <w:bottom w:type="dxa" w:w="70"/>
-              <w:right w:type="dxa" w:w="110"/>
-            </w:tcMar>
-          </w:tcPr>
-          <w:p>
-            <w:r>
+            <w:tcW w:type="dxa" w:w="772"/>
+            <w:tcBorders>
+              <w:top w:val="single" w:color="D8DBE3" w:sz="6"/>
+              <w:left w:val="single" w:color="D8DBE3" w:sz="6"/>
+              <w:bottom w:val="single" w:color="D8DBE3" w:sz="6"/>
+              <w:right w:val="single" w:color="D8DBE3" w:sz="6"/>
+            </w:tcBorders>
+            <w:tcMar>
+              <w:top w:type="dxa" w:w="70"/>
+              <w:left w:type="dxa" w:w="110"/>
+              <w:bottom w:type="dxa" w:w="70"/>
+              <w:right w:type="dxa" w:w="110"/>
+            </w:tcMar>
+          </w:tcPr>
+          <w:p>
+            <w:pPr>
+              <w:keepNext/>
+              <w:keepLines/>
+            </w:pPr>
+            <w:r>
+              <w:rPr>
+                <w:sz w:val="17"/>
+                <w:szCs w:val="17"/>
+              </w:rPr>
               <w:t xml:space="preserve">POST</w:t>
             </w:r>
           </w:p>
         </w:tc>
         <w:tc>
           <w:tcPr>
-            <w:tcW w:type="dxa" w:w="3100"/>
-            <w:tcBorders>
-              <w:top w:val="single" w:color="D8DBE3" w:sz="6"/>
-              <w:left w:val="single" w:color="D8DBE3" w:sz="6"/>
-              <w:bottom w:val="single" w:color="D8DBE3" w:sz="6"/>
-              <w:right w:val="single" w:color="D8DBE3" w:sz="6"/>
-            </w:tcBorders>
-            <w:tcMar>
-              <w:top w:type="dxa" w:w="70"/>
-              <w:left w:type="dxa" w:w="110"/>
-              <w:bottom w:type="dxa" w:w="70"/>
-              <w:right w:type="dxa" w:w="110"/>
-            </w:tcMar>
-          </w:tcPr>
-          <w:p>
+            <w:tcW w:type="dxa" w:w="2276"/>
+            <w:tcBorders>
+              <w:top w:val="single" w:color="D8DBE3" w:sz="6"/>
+              <w:left w:val="single" w:color="D8DBE3" w:sz="6"/>
+              <w:bottom w:val="single" w:color="D8DBE3" w:sz="6"/>
+              <w:right w:val="single" w:color="D8DBE3" w:sz="6"/>
+            </w:tcBorders>
+            <w:tcMar>
+              <w:top w:type="dxa" w:w="70"/>
+              <w:left w:type="dxa" w:w="110"/>
+              <w:bottom w:type="dxa" w:w="70"/>
+              <w:right w:type="dxa" w:w="110"/>
+            </w:tcMar>
+          </w:tcPr>
+          <w:p>
+            <w:pPr>
+              <w:keepNext/>
+              <w:keepLines/>
+            </w:pPr>
             <w:r>
               <w:rPr>
                 <w:rFonts w:ascii="Consolas" w:cs="Consolas" w:eastAsia="Consolas" w:hAnsi="Consolas"/>
                 <w:color w:val="7C3AED"/>
-                <w:sz w:val="19"/>
-                <w:szCs w:val="19"/>
-              </w:rPr>
-              <w:t xml:space="preserve">/events/order</w:t>
-            </w:r>
-          </w:p>
-        </w:tc>
-        <w:tc>
-          <w:tcPr>
-            <w:tcW w:type="dxa" w:w="4106"/>
-            <w:tcBorders>
-              <w:top w:val="single" w:color="D8DBE3" w:sz="6"/>
-              <w:left w:val="single" w:color="D8DBE3" w:sz="6"/>
-              <w:bottom w:val="single" w:color="D8DBE3" w:sz="6"/>
-              <w:right w:val="single" w:color="D8DBE3" w:sz="6"/>
-            </w:tcBorders>
-            <w:tcMar>
-              <w:top w:type="dxa" w:w="70"/>
-              <w:left w:type="dxa" w:w="110"/>
-              <w:bottom w:type="dxa" w:w="70"/>
-              <w:right w:type="dxa" w:w="110"/>
-            </w:tcMar>
-          </w:tcPr>
-          <w:p>
-            <w:r>
-              <w:t xml:space="preserve">Order Book buy/sell order</w:t>
+                <w:sz w:val="17"/>
+                <w:szCs w:val="17"/>
+              </w:rPr>
+              <w:t xml:space="preserve">/events/close</w:t>
+            </w:r>
+          </w:p>
+        </w:tc>
+        <w:tc>
+          <w:tcPr>
+            <w:tcW w:type="dxa" w:w="3628"/>
+            <w:tcBorders>
+              <w:top w:val="single" w:color="D8DBE3" w:sz="6"/>
+              <w:left w:val="single" w:color="D8DBE3" w:sz="6"/>
+              <w:bottom w:val="single" w:color="D8DBE3" w:sz="6"/>
+              <w:right w:val="single" w:color="D8DBE3" w:sz="6"/>
+            </w:tcBorders>
+            <w:tcMar>
+              <w:top w:type="dxa" w:w="70"/>
+              <w:left w:type="dxa" w:w="110"/>
+              <w:bottom w:type="dxa" w:w="70"/>
+              <w:right w:type="dxa" w:w="110"/>
+            </w:tcMar>
+          </w:tcPr>
+          <w:p>
+            <w:pPr>
+              <w:keepNext/>
+              <w:keepLines/>
+            </w:pPr>
+            <w:r>
+              <w:rPr>
+                <w:rFonts w:ascii="Consolas" w:cs="Consolas" w:eastAsia="Consolas" w:hAnsi="Consolas"/>
+                <w:color w:val="7C3AED"/>
+                <w:sz w:val="17"/>
+                <w:szCs w:val="17"/>
+              </w:rPr>
+              <w:t xml:space="preserve">{"mmName": "alice", "eventName": "X", "winningOptionIndex": 0}</w:t>
+            </w:r>
+          </w:p>
+        </w:tc>
+        <w:tc>
+          <w:tcPr>
+            <w:tcW w:type="dxa" w:w="1630"/>
+            <w:tcBorders>
+              <w:top w:val="single" w:color="D8DBE3" w:sz="6"/>
+              <w:left w:val="single" w:color="D8DBE3" w:sz="6"/>
+              <w:bottom w:val="single" w:color="D8DBE3" w:sz="6"/>
+              <w:right w:val="single" w:color="D8DBE3" w:sz="6"/>
+            </w:tcBorders>
+            <w:tcMar>
+              <w:top w:type="dxa" w:w="70"/>
+              <w:left w:type="dxa" w:w="110"/>
+              <w:bottom w:type="dxa" w:w="70"/>
+              <w:right w:type="dxa" w:w="110"/>
+            </w:tcMar>
+          </w:tcPr>
+          <w:p>
+            <w:pPr>
+              <w:keepNext/>
+              <w:keepLines/>
+            </w:pPr>
+            <w:r>
+              <w:rPr>
+                <w:sz w:val="17"/>
+                <w:szCs w:val="17"/>
+              </w:rPr>
+              <w:t xml:space="preserve">MM closes it, picks the winner.</w:t>
             </w:r>
           </w:p>
         </w:tc>
       </w:tr>
       <w:tr>
         <w:trPr>
+          <w:cantSplit/>
           <w:tblHeader w:val="off"/>
         </w:trPr>
         <w:tc>
           <w:tcPr>
-            <w:tcW w:type="dxa" w:w="1100"/>
-            <w:tcBorders>
-              <w:top w:val="single" w:color="D8DBE3" w:sz="6"/>
-              <w:left w:val="single" w:color="D8DBE3" w:sz="6"/>
-              <w:bottom w:val="single" w:color="D8DBE3" w:sz="6"/>
-              <w:right w:val="single" w:color="D8DBE3" w:sz="6"/>
-            </w:tcBorders>
-            <w:tcMar>
-              <w:top w:type="dxa" w:w="70"/>
-              <w:left w:type="dxa" w:w="110"/>
-              <w:bottom w:type="dxa" w:w="70"/>
-              <w:right w:type="dxa" w:w="110"/>
-            </w:tcMar>
-          </w:tcPr>
-          <w:p>
-            <w:r>
+            <w:tcW w:type="dxa" w:w="772"/>
+            <w:tcBorders>
+              <w:top w:val="single" w:color="D8DBE3" w:sz="6"/>
+              <w:left w:val="single" w:color="D8DBE3" w:sz="6"/>
+              <w:bottom w:val="single" w:color="D8DBE3" w:sz="6"/>
+              <w:right w:val="single" w:color="D8DBE3" w:sz="6"/>
+            </w:tcBorders>
+            <w:tcMar>
+              <w:top w:type="dxa" w:w="70"/>
+              <w:left w:type="dxa" w:w="110"/>
+              <w:bottom w:type="dxa" w:w="70"/>
+              <w:right w:type="dxa" w:w="110"/>
+            </w:tcMar>
+          </w:tcPr>
+          <w:p>
+            <w:pPr>
+              <w:keepNext/>
+              <w:keepLines/>
+            </w:pPr>
+            <w:r>
+              <w:rPr>
+                <w:sz w:val="17"/>
+                <w:szCs w:val="17"/>
+              </w:rPr>
               <w:t xml:space="preserve">POST</w:t>
             </w:r>
           </w:p>
         </w:tc>
         <w:tc>
           <w:tcPr>
-            <w:tcW w:type="dxa" w:w="3100"/>
-            <w:tcBorders>
-              <w:top w:val="single" w:color="D8DBE3" w:sz="6"/>
-              <w:left w:val="single" w:color="D8DBE3" w:sz="6"/>
-              <w:bottom w:val="single" w:color="D8DBE3" w:sz="6"/>
-              <w:right w:val="single" w:color="D8DBE3" w:sz="6"/>
-            </w:tcBorders>
-            <w:tcMar>
-              <w:top w:type="dxa" w:w="70"/>
-              <w:left w:type="dxa" w:w="110"/>
-              <w:bottom w:type="dxa" w:w="70"/>
-              <w:right w:type="dxa" w:w="110"/>
-            </w:tcMar>
-          </w:tcPr>
-          <w:p>
+            <w:tcW w:type="dxa" w:w="2276"/>
+            <w:tcBorders>
+              <w:top w:val="single" w:color="D8DBE3" w:sz="6"/>
+              <w:left w:val="single" w:color="D8DBE3" w:sz="6"/>
+              <w:bottom w:val="single" w:color="D8DBE3" w:sz="6"/>
+              <w:right w:val="single" w:color="D8DBE3" w:sz="6"/>
+            </w:tcBorders>
+            <w:tcMar>
+              <w:top w:type="dxa" w:w="70"/>
+              <w:left w:type="dxa" w:w="110"/>
+              <w:bottom w:type="dxa" w:w="70"/>
+              <w:right w:type="dxa" w:w="110"/>
+            </w:tcMar>
+          </w:tcPr>
+          <w:p>
+            <w:pPr>
+              <w:keepNext/>
+              <w:keepLines/>
+            </w:pPr>
             <w:r>
               <w:rPr>
                 <w:rFonts w:ascii="Consolas" w:cs="Consolas" w:eastAsia="Consolas" w:hAnsi="Consolas"/>
                 <w:color w:val="7C3AED"/>
-                <w:sz w:val="19"/>
-                <w:szCs w:val="19"/>
-              </w:rPr>
-              <w:t xml:space="preserve">/events/open</w:t>
-            </w:r>
-            <w:r>
-              <w:t xml:space="preserve">, </w:t>
-            </w:r>
+                <w:sz w:val="17"/>
+                <w:szCs w:val="17"/>
+              </w:rPr>
+              <w:t xml:space="preserve">/events/buy</w:t>
+            </w:r>
+          </w:p>
+        </w:tc>
+        <w:tc>
+          <w:tcPr>
+            <w:tcW w:type="dxa" w:w="3628"/>
+            <w:tcBorders>
+              <w:top w:val="single" w:color="D8DBE3" w:sz="6"/>
+              <w:left w:val="single" w:color="D8DBE3" w:sz="6"/>
+              <w:bottom w:val="single" w:color="D8DBE3" w:sz="6"/>
+              <w:right w:val="single" w:color="D8DBE3" w:sz="6"/>
+            </w:tcBorders>
+            <w:tcMar>
+              <w:top w:type="dxa" w:w="70"/>
+              <w:left w:type="dxa" w:w="110"/>
+              <w:bottom w:type="dxa" w:w="70"/>
+              <w:right w:type="dxa" w:w="110"/>
+            </w:tcMar>
+          </w:tcPr>
+          <w:p>
+            <w:pPr>
+              <w:keepNext/>
+              <w:keepLines/>
+            </w:pPr>
             <w:r>
               <w:rPr>
                 <w:rFonts w:ascii="Consolas" w:cs="Consolas" w:eastAsia="Consolas" w:hAnsi="Consolas"/>
                 <w:color w:val="7C3AED"/>
-                <w:sz w:val="19"/>
-                <w:szCs w:val="19"/>
-              </w:rPr>
-              <w:t xml:space="preserve">/events/close</w:t>
-            </w:r>
-          </w:p>
-        </w:tc>
-        <w:tc>
-          <w:tcPr>
-            <w:tcW w:type="dxa" w:w="4106"/>
-            <w:tcBorders>
-              <w:top w:val="single" w:color="D8DBE3" w:sz="6"/>
-              <w:left w:val="single" w:color="D8DBE3" w:sz="6"/>
-              <w:bottom w:val="single" w:color="D8DBE3" w:sz="6"/>
-              <w:right w:val="single" w:color="D8DBE3" w:sz="6"/>
-            </w:tcBorders>
-            <w:tcMar>
-              <w:top w:type="dxa" w:w="70"/>
-              <w:left w:type="dxa" w:w="110"/>
-              <w:bottom w:type="dxa" w:w="70"/>
-              <w:right w:type="dxa" w:w="110"/>
-            </w:tcMar>
-          </w:tcPr>
-          <w:p>
-            <w:r>
-              <w:t xml:space="preserve">Market Maker opens / resolves an event</w:t>
+                <w:sz w:val="17"/>
+                <w:szCs w:val="17"/>
+              </w:rPr>
+              <w:t xml:space="preserve">{"memberName": "alice", "eventName": "X", "optionIndex": 0, "quantity": 5}</w:t>
+            </w:r>
+          </w:p>
+        </w:tc>
+        <w:tc>
+          <w:tcPr>
+            <w:tcW w:type="dxa" w:w="1630"/>
+            <w:tcBorders>
+              <w:top w:val="single" w:color="D8DBE3" w:sz="6"/>
+              <w:left w:val="single" w:color="D8DBE3" w:sz="6"/>
+              <w:bottom w:val="single" w:color="D8DBE3" w:sz="6"/>
+              <w:right w:val="single" w:color="D8DBE3" w:sz="6"/>
+            </w:tcBorders>
+            <w:tcMar>
+              <w:top w:type="dxa" w:w="70"/>
+              <w:left w:type="dxa" w:w="110"/>
+              <w:bottom w:type="dxa" w:w="70"/>
+              <w:right w:type="dxa" w:w="110"/>
+            </w:tcMar>
+          </w:tcPr>
+          <w:p>
+            <w:pPr>
+              <w:keepNext/>
+              <w:keepLines/>
+            </w:pPr>
+            <w:r>
+              <w:rPr>
+                <w:sz w:val="17"/>
+                <w:szCs w:val="17"/>
+              </w:rPr>
+              <w:t xml:space="preserve">Buy shares (LMSR events).</w:t>
             </w:r>
           </w:p>
         </w:tc>
       </w:tr>
       <w:tr>
         <w:trPr>
+          <w:cantSplit/>
           <w:tblHeader w:val="off"/>
         </w:trPr>
         <w:tc>
           <w:tcPr>
-            <w:tcW w:type="dxa" w:w="1100"/>
-            <w:tcBorders>
-              <w:top w:val="single" w:color="D8DBE3" w:sz="6"/>
-              <w:left w:val="single" w:color="D8DBE3" w:sz="6"/>
-              <w:bottom w:val="single" w:color="D8DBE3" w:sz="6"/>
-              <w:right w:val="single" w:color="D8DBE3" w:sz="6"/>
-            </w:tcBorders>
-            <w:tcMar>
-              <w:top w:type="dxa" w:w="70"/>
-              <w:left w:type="dxa" w:w="110"/>
-              <w:bottom w:type="dxa" w:w="70"/>
-              <w:right w:type="dxa" w:w="110"/>
-            </w:tcMar>
-          </w:tcPr>
-          <w:p>
-            <w:r>
+            <w:tcW w:type="dxa" w:w="772"/>
+            <w:tcBorders>
+              <w:top w:val="single" w:color="D8DBE3" w:sz="6"/>
+              <w:left w:val="single" w:color="D8DBE3" w:sz="6"/>
+              <w:bottom w:val="single" w:color="D8DBE3" w:sz="6"/>
+              <w:right w:val="single" w:color="D8DBE3" w:sz="6"/>
+            </w:tcBorders>
+            <w:tcMar>
+              <w:top w:type="dxa" w:w="70"/>
+              <w:left w:type="dxa" w:w="110"/>
+              <w:bottom w:type="dxa" w:w="70"/>
+              <w:right w:type="dxa" w:w="110"/>
+            </w:tcMar>
+          </w:tcPr>
+          <w:p>
+            <w:pPr>
+              <w:keepNext/>
+              <w:keepLines/>
+            </w:pPr>
+            <w:r>
+              <w:rPr>
+                <w:sz w:val="17"/>
+                <w:szCs w:val="17"/>
+              </w:rPr>
               <w:t xml:space="preserve">POST</w:t>
             </w:r>
           </w:p>
         </w:tc>
         <w:tc>
           <w:tcPr>
-            <w:tcW w:type="dxa" w:w="3100"/>
-            <w:tcBorders>
-              <w:top w:val="single" w:color="D8DBE3" w:sz="6"/>
-              <w:left w:val="single" w:color="D8DBE3" w:sz="6"/>
-              <w:bottom w:val="single" w:color="D8DBE3" w:sz="6"/>
-              <w:right w:val="single" w:color="D8DBE3" w:sz="6"/>
-            </w:tcBorders>
-            <w:tcMar>
-              <w:top w:type="dxa" w:w="70"/>
-              <w:left w:type="dxa" w:w="110"/>
-              <w:bottom w:type="dxa" w:w="70"/>
-              <w:right w:type="dxa" w:w="110"/>
-            </w:tcMar>
-          </w:tcPr>
-          <w:p>
+            <w:tcW w:type="dxa" w:w="2276"/>
+            <w:tcBorders>
+              <w:top w:val="single" w:color="D8DBE3" w:sz="6"/>
+              <w:left w:val="single" w:color="D8DBE3" w:sz="6"/>
+              <w:bottom w:val="single" w:color="D8DBE3" w:sz="6"/>
+              <w:right w:val="single" w:color="D8DBE3" w:sz="6"/>
+            </w:tcBorders>
+            <w:tcMar>
+              <w:top w:type="dxa" w:w="70"/>
+              <w:left w:type="dxa" w:w="110"/>
+              <w:bottom w:type="dxa" w:w="70"/>
+              <w:right w:type="dxa" w:w="110"/>
+            </w:tcMar>
+          </w:tcPr>
+          <w:p>
+            <w:pPr>
+              <w:keepNext/>
+              <w:keepLines/>
+            </w:pPr>
             <w:r>
               <w:rPr>
                 <w:rFonts w:ascii="Consolas" w:cs="Consolas" w:eastAsia="Consolas" w:hAnsi="Consolas"/>
                 <w:color w:val="7C3AED"/>
-                <w:sz w:val="19"/>
-                <w:szCs w:val="19"/>
-              </w:rPr>
-              <w:t xml:space="preserve">/events/create-lmsr</w:t>
-            </w:r>
-            <w:r>
-              <w:t xml:space="preserve">, </w:t>
-            </w:r>
+                <w:sz w:val="17"/>
+                <w:szCs w:val="17"/>
+              </w:rPr>
+              <w:t xml:space="preserve">/events/order</w:t>
+            </w:r>
+          </w:p>
+        </w:tc>
+        <w:tc>
+          <w:tcPr>
+            <w:tcW w:type="dxa" w:w="3628"/>
+            <w:tcBorders>
+              <w:top w:val="single" w:color="D8DBE3" w:sz="6"/>
+              <w:left w:val="single" w:color="D8DBE3" w:sz="6"/>
+              <w:bottom w:val="single" w:color="D8DBE3" w:sz="6"/>
+              <w:right w:val="single" w:color="D8DBE3" w:sz="6"/>
+            </w:tcBorders>
+            <w:tcMar>
+              <w:top w:type="dxa" w:w="70"/>
+              <w:left w:type="dxa" w:w="110"/>
+              <w:bottom w:type="dxa" w:w="70"/>
+              <w:right w:type="dxa" w:w="110"/>
+            </w:tcMar>
+          </w:tcPr>
+          <w:p>
+            <w:pPr>
+              <w:keepNext/>
+              <w:keepLines/>
+            </w:pPr>
             <w:r>
               <w:rPr>
                 <w:rFonts w:ascii="Consolas" w:cs="Consolas" w:eastAsia="Consolas" w:hAnsi="Consolas"/>
                 <w:color w:val="7C3AED"/>
-                <w:sz w:val="19"/>
-                <w:szCs w:val="19"/>
-              </w:rPr>
-              <w:t xml:space="preserve">/events/create-orderbook</w:t>
-            </w:r>
-          </w:p>
-        </w:tc>
-        <w:tc>
-          <w:tcPr>
-            <w:tcW w:type="dxa" w:w="4106"/>
-            <w:tcBorders>
-              <w:top w:val="single" w:color="D8DBE3" w:sz="6"/>
-              <w:left w:val="single" w:color="D8DBE3" w:sz="6"/>
-              <w:bottom w:val="single" w:color="D8DBE3" w:sz="6"/>
-              <w:right w:val="single" w:color="D8DBE3" w:sz="6"/>
-            </w:tcBorders>
-            <w:tcMar>
-              <w:top w:type="dxa" w:w="70"/>
-              <w:left w:type="dxa" w:w="110"/>
-              <w:bottom w:type="dxa" w:w="70"/>
-              <w:right w:type="dxa" w:w="110"/>
-            </w:tcMar>
-          </w:tcPr>
-          <w:p>
-            <w:r>
-              <w:t xml:space="preserve">Create Event</w:t>
+                <w:sz w:val="17"/>
+                <w:szCs w:val="17"/>
+              </w:rPr>
+              <w:t xml:space="preserve">{"userName": "alice", "eventName": "X", "optionIndex": 0, "side": "BUY", "price": 0.45, "quantity": 4}</w:t>
+            </w:r>
+          </w:p>
+        </w:tc>
+        <w:tc>
+          <w:tcPr>
+            <w:tcW w:type="dxa" w:w="1630"/>
+            <w:tcBorders>
+              <w:top w:val="single" w:color="D8DBE3" w:sz="6"/>
+              <w:left w:val="single" w:color="D8DBE3" w:sz="6"/>
+              <w:bottom w:val="single" w:color="D8DBE3" w:sz="6"/>
+              <w:right w:val="single" w:color="D8DBE3" w:sz="6"/>
+            </w:tcBorders>
+            <w:tcMar>
+              <w:top w:type="dxa" w:w="70"/>
+              <w:left w:type="dxa" w:w="110"/>
+              <w:bottom w:type="dxa" w:w="70"/>
+              <w:right w:type="dxa" w:w="110"/>
+            </w:tcMar>
+          </w:tcPr>
+          <w:p>
+            <w:pPr>
+              <w:keepNext/>
+              <w:keepLines/>
+            </w:pPr>
+            <w:r>
+              <w:rPr>
+                <w:sz w:val="17"/>
+                <w:szCs w:val="17"/>
+              </w:rPr>
+              <w:t xml:space="preserve">Bid/ask (Order Book events).</w:t>
             </w:r>
           </w:p>
         </w:tc>
       </w:tr>
       <w:tr>
         <w:trPr>
+          <w:cantSplit/>
           <w:tblHeader w:val="off"/>
         </w:trPr>
         <w:tc>
           <w:tcPr>
-            <w:tcW w:type="dxa" w:w="1100"/>
-            <w:tcBorders>
-              <w:top w:val="single" w:color="D8DBE3" w:sz="6"/>
-              <w:left w:val="single" w:color="D8DBE3" w:sz="6"/>
-              <w:bottom w:val="single" w:color="D8DBE3" w:sz="6"/>
-              <w:right w:val="single" w:color="D8DBE3" w:sz="6"/>
-            </w:tcBorders>
-            <w:tcMar>
-              <w:top w:type="dxa" w:w="70"/>
-              <w:left w:type="dxa" w:w="110"/>
-              <w:bottom w:type="dxa" w:w="70"/>
-              <w:right w:type="dxa" w:w="110"/>
-            </w:tcMar>
-          </w:tcPr>
-          <w:p>
-            <w:r>
-              <w:t xml:space="preserve">GET / POST</w:t>
-            </w:r>
-          </w:p>
-        </w:tc>
-        <w:tc>
-          <w:tcPr>
-            <w:tcW w:type="dxa" w:w="3100"/>
-            <w:tcBorders>
-              <w:top w:val="single" w:color="D8DBE3" w:sz="6"/>
-              <w:left w:val="single" w:color="D8DBE3" w:sz="6"/>
-              <w:bottom w:val="single" w:color="D8DBE3" w:sz="6"/>
-              <w:right w:val="single" w:color="D8DBE3" w:sz="6"/>
-            </w:tcBorders>
-            <w:tcMar>
-              <w:top w:type="dxa" w:w="70"/>
-              <w:left w:type="dxa" w:w="110"/>
-              <w:bottom w:type="dxa" w:w="70"/>
-              <w:right w:type="dxa" w:w="110"/>
-            </w:tcMar>
-          </w:tcPr>
-          <w:p>
+            <w:tcW w:type="dxa" w:w="772"/>
+            <w:tcBorders>
+              <w:top w:val="single" w:color="D8DBE3" w:sz="6"/>
+              <w:left w:val="single" w:color="D8DBE3" w:sz="6"/>
+              <w:bottom w:val="single" w:color="D8DBE3" w:sz="6"/>
+              <w:right w:val="single" w:color="D8DBE3" w:sz="6"/>
+            </w:tcBorders>
+            <w:tcMar>
+              <w:top w:type="dxa" w:w="70"/>
+              <w:left w:type="dxa" w:w="110"/>
+              <w:bottom w:type="dxa" w:w="70"/>
+              <w:right w:type="dxa" w:w="110"/>
+            </w:tcMar>
+          </w:tcPr>
+          <w:p>
+            <w:pPr>
+              <w:keepNext/>
+              <w:keepLines/>
+            </w:pPr>
+            <w:r>
+              <w:rPr>
+                <w:sz w:val="17"/>
+                <w:szCs w:val="17"/>
+              </w:rPr>
+              <w:t xml:space="preserve">POST</w:t>
+            </w:r>
+          </w:p>
+        </w:tc>
+        <w:tc>
+          <w:tcPr>
+            <w:tcW w:type="dxa" w:w="2276"/>
+            <w:tcBorders>
+              <w:top w:val="single" w:color="D8DBE3" w:sz="6"/>
+              <w:left w:val="single" w:color="D8DBE3" w:sz="6"/>
+              <w:bottom w:val="single" w:color="D8DBE3" w:sz="6"/>
+              <w:right w:val="single" w:color="D8DBE3" w:sz="6"/>
+            </w:tcBorders>
+            <w:tcMar>
+              <w:top w:type="dxa" w:w="70"/>
+              <w:left w:type="dxa" w:w="110"/>
+              <w:bottom w:type="dxa" w:w="70"/>
+              <w:right w:type="dxa" w:w="110"/>
+            </w:tcMar>
+          </w:tcPr>
+          <w:p>
+            <w:pPr>
+              <w:keepNext/>
+              <w:keepLines/>
+            </w:pPr>
             <w:r>
               <w:rPr>
                 <w:rFonts w:ascii="Consolas" w:cs="Consolas" w:eastAsia="Consolas" w:hAnsi="Consolas"/>
                 <w:color w:val="7C3AED"/>
-                <w:sz w:val="19"/>
-                <w:szCs w:val="19"/>
+                <w:sz w:val="17"/>
+                <w:szCs w:val="17"/>
+              </w:rPr>
+              <w:t xml:space="preserve">/events/create-lmsr</w:t>
+            </w:r>
+          </w:p>
+        </w:tc>
+        <w:tc>
+          <w:tcPr>
+            <w:tcW w:type="dxa" w:w="3628"/>
+            <w:tcBorders>
+              <w:top w:val="single" w:color="D8DBE3" w:sz="6"/>
+              <w:left w:val="single" w:color="D8DBE3" w:sz="6"/>
+              <w:bottom w:val="single" w:color="D8DBE3" w:sz="6"/>
+              <w:right w:val="single" w:color="D8DBE3" w:sz="6"/>
+            </w:tcBorders>
+            <w:tcMar>
+              <w:top w:type="dxa" w:w="70"/>
+              <w:left w:type="dxa" w:w="110"/>
+              <w:bottom w:type="dxa" w:w="70"/>
+              <w:right w:type="dxa" w:w="110"/>
+            </w:tcMar>
+          </w:tcPr>
+          <w:p>
+            <w:pPr>
+              <w:keepNext/>
+              <w:keepLines/>
+            </w:pPr>
+            <w:r>
+              <w:rPr>
+                <w:rFonts w:ascii="Consolas" w:cs="Consolas" w:eastAsia="Consolas" w:hAnsi="Consolas"/>
+                <w:color w:val="7C3AED"/>
+                <w:sz w:val="17"/>
+                <w:szCs w:val="17"/>
+              </w:rPr>
+              <w:t xml:space="preserve">{"creatorName": "alice", "name": "X", "description": "...", "commission": 5, "commissionType": "ON_PURCHASE", "optionNames": ["Yes", "No"], "b": 100}</w:t>
+            </w:r>
+          </w:p>
+        </w:tc>
+        <w:tc>
+          <w:tcPr>
+            <w:tcW w:type="dxa" w:w="1630"/>
+            <w:tcBorders>
+              <w:top w:val="single" w:color="D8DBE3" w:sz="6"/>
+              <w:left w:val="single" w:color="D8DBE3" w:sz="6"/>
+              <w:bottom w:val="single" w:color="D8DBE3" w:sz="6"/>
+              <w:right w:val="single" w:color="D8DBE3" w:sz="6"/>
+            </w:tcBorders>
+            <w:tcMar>
+              <w:top w:type="dxa" w:w="70"/>
+              <w:left w:type="dxa" w:w="110"/>
+              <w:bottom w:type="dxa" w:w="70"/>
+              <w:right w:type="dxa" w:w="110"/>
+            </w:tcMar>
+          </w:tcPr>
+          <w:p>
+            <w:pPr>
+              <w:keepNext/>
+              <w:keepLines/>
+            </w:pPr>
+            <w:r>
+              <w:rPr>
+                <w:sz w:val="17"/>
+                <w:szCs w:val="17"/>
+              </w:rPr>
+              <w:t xml:space="preserve">Create Event (LMSR).</w:t>
+            </w:r>
+          </w:p>
+        </w:tc>
+      </w:tr>
+      <w:tr>
+        <w:trPr>
+          <w:cantSplit/>
+          <w:tblHeader w:val="off"/>
+        </w:trPr>
+        <w:tc>
+          <w:tcPr>
+            <w:tcW w:type="dxa" w:w="772"/>
+            <w:tcBorders>
+              <w:top w:val="single" w:color="D8DBE3" w:sz="6"/>
+              <w:left w:val="single" w:color="D8DBE3" w:sz="6"/>
+              <w:bottom w:val="single" w:color="D8DBE3" w:sz="6"/>
+              <w:right w:val="single" w:color="D8DBE3" w:sz="6"/>
+            </w:tcBorders>
+            <w:tcMar>
+              <w:top w:type="dxa" w:w="70"/>
+              <w:left w:type="dxa" w:w="110"/>
+              <w:bottom w:type="dxa" w:w="70"/>
+              <w:right w:type="dxa" w:w="110"/>
+            </w:tcMar>
+          </w:tcPr>
+          <w:p>
+            <w:pPr>
+              <w:keepNext/>
+              <w:keepLines/>
+            </w:pPr>
+            <w:r>
+              <w:rPr>
+                <w:sz w:val="17"/>
+                <w:szCs w:val="17"/>
+              </w:rPr>
+              <w:t xml:space="preserve">POST</w:t>
+            </w:r>
+          </w:p>
+        </w:tc>
+        <w:tc>
+          <w:tcPr>
+            <w:tcW w:type="dxa" w:w="2276"/>
+            <w:tcBorders>
+              <w:top w:val="single" w:color="D8DBE3" w:sz="6"/>
+              <w:left w:val="single" w:color="D8DBE3" w:sz="6"/>
+              <w:bottom w:val="single" w:color="D8DBE3" w:sz="6"/>
+              <w:right w:val="single" w:color="D8DBE3" w:sz="6"/>
+            </w:tcBorders>
+            <w:tcMar>
+              <w:top w:type="dxa" w:w="70"/>
+              <w:left w:type="dxa" w:w="110"/>
+              <w:bottom w:type="dxa" w:w="70"/>
+              <w:right w:type="dxa" w:w="110"/>
+            </w:tcMar>
+          </w:tcPr>
+          <w:p>
+            <w:pPr>
+              <w:keepNext/>
+              <w:keepLines/>
+            </w:pPr>
+            <w:r>
+              <w:rPr>
+                <w:rFonts w:ascii="Consolas" w:cs="Consolas" w:eastAsia="Consolas" w:hAnsi="Consolas"/>
+                <w:color w:val="7C3AED"/>
+                <w:sz w:val="17"/>
+                <w:szCs w:val="17"/>
+              </w:rPr>
+              <w:t xml:space="preserve">/events/create-orderbook</w:t>
+            </w:r>
+          </w:p>
+        </w:tc>
+        <w:tc>
+          <w:tcPr>
+            <w:tcW w:type="dxa" w:w="3628"/>
+            <w:tcBorders>
+              <w:top w:val="single" w:color="D8DBE3" w:sz="6"/>
+              <w:left w:val="single" w:color="D8DBE3" w:sz="6"/>
+              <w:bottom w:val="single" w:color="D8DBE3" w:sz="6"/>
+              <w:right w:val="single" w:color="D8DBE3" w:sz="6"/>
+            </w:tcBorders>
+            <w:tcMar>
+              <w:top w:type="dxa" w:w="70"/>
+              <w:left w:type="dxa" w:w="110"/>
+              <w:bottom w:type="dxa" w:w="70"/>
+              <w:right w:type="dxa" w:w="110"/>
+            </w:tcMar>
+          </w:tcPr>
+          <w:p>
+            <w:pPr>
+              <w:keepNext/>
+              <w:keepLines/>
+            </w:pPr>
+            <w:r>
+              <w:rPr>
+                <w:rFonts w:ascii="Consolas" w:cs="Consolas" w:eastAsia="Consolas" w:hAnsi="Consolas"/>
+                <w:color w:val="7C3AED"/>
+                <w:sz w:val="17"/>
+                <w:szCs w:val="17"/>
+              </w:rPr>
+              <w:t xml:space="preserve">{"creatorName": "alice", "name": "X", "description": "...", "commission": 5, "commissionType": "ON_PURCHASE", "optionNames": ["Yes", "No"], "allowMint": true, "initial": 50, "d": 1}</w:t>
+            </w:r>
+          </w:p>
+        </w:tc>
+        <w:tc>
+          <w:tcPr>
+            <w:tcW w:type="dxa" w:w="1630"/>
+            <w:tcBorders>
+              <w:top w:val="single" w:color="D8DBE3" w:sz="6"/>
+              <w:left w:val="single" w:color="D8DBE3" w:sz="6"/>
+              <w:bottom w:val="single" w:color="D8DBE3" w:sz="6"/>
+              <w:right w:val="single" w:color="D8DBE3" w:sz="6"/>
+            </w:tcBorders>
+            <w:tcMar>
+              <w:top w:type="dxa" w:w="70"/>
+              <w:left w:type="dxa" w:w="110"/>
+              <w:bottom w:type="dxa" w:w="70"/>
+              <w:right w:type="dxa" w:w="110"/>
+            </w:tcMar>
+          </w:tcPr>
+          <w:p>
+            <w:pPr>
+              <w:keepNext/>
+              <w:keepLines/>
+            </w:pPr>
+            <w:r>
+              <w:rPr>
+                <w:sz w:val="17"/>
+                <w:szCs w:val="17"/>
+              </w:rPr>
+              <w:t xml:space="preserve">Create Event (Order Book).</w:t>
+            </w:r>
+          </w:p>
+        </w:tc>
+      </w:tr>
+      <w:tr>
+        <w:trPr>
+          <w:cantSplit/>
+          <w:tblHeader w:val="off"/>
+        </w:trPr>
+        <w:tc>
+          <w:tcPr>
+            <w:tcW w:type="dxa" w:w="772"/>
+            <w:tcBorders>
+              <w:top w:val="single" w:color="D8DBE3" w:sz="6"/>
+              <w:left w:val="single" w:color="D8DBE3" w:sz="6"/>
+              <w:bottom w:val="single" w:color="D8DBE3" w:sz="6"/>
+              <w:right w:val="single" w:color="D8DBE3" w:sz="6"/>
+            </w:tcBorders>
+            <w:tcMar>
+              <w:top w:type="dxa" w:w="70"/>
+              <w:left w:type="dxa" w:w="110"/>
+              <w:bottom w:type="dxa" w:w="70"/>
+              <w:right w:type="dxa" w:w="110"/>
+            </w:tcMar>
+          </w:tcPr>
+          <w:p>
+            <w:pPr>
+              <w:keepNext/>
+              <w:keepLines/>
+            </w:pPr>
+            <w:r>
+              <w:rPr>
+                <w:sz w:val="17"/>
+                <w:szCs w:val="17"/>
+              </w:rPr>
+              <w:t xml:space="preserve">POST</w:t>
+            </w:r>
+          </w:p>
+        </w:tc>
+        <w:tc>
+          <w:tcPr>
+            <w:tcW w:type="dxa" w:w="2276"/>
+            <w:tcBorders>
+              <w:top w:val="single" w:color="D8DBE3" w:sz="6"/>
+              <w:left w:val="single" w:color="D8DBE3" w:sz="6"/>
+              <w:bottom w:val="single" w:color="D8DBE3" w:sz="6"/>
+              <w:right w:val="single" w:color="D8DBE3" w:sz="6"/>
+            </w:tcBorders>
+            <w:tcMar>
+              <w:top w:type="dxa" w:w="70"/>
+              <w:left w:type="dxa" w:w="110"/>
+              <w:bottom w:type="dxa" w:w="70"/>
+              <w:right w:type="dxa" w:w="110"/>
+            </w:tcMar>
+          </w:tcPr>
+          <w:p>
+            <w:pPr>
+              <w:keepNext/>
+              <w:keepLines/>
+            </w:pPr>
+            <w:r>
+              <w:rPr>
+                <w:rFonts w:ascii="Consolas" w:cs="Consolas" w:eastAsia="Consolas" w:hAnsi="Consolas"/>
+                <w:color w:val="7C3AED"/>
+                <w:sz w:val="17"/>
+                <w:szCs w:val="17"/>
               </w:rPr>
               <w:t xml:space="preserve">/chat</w:t>
             </w:r>
@@ -2380,23 +3259,191 @@
         </w:tc>
         <w:tc>
           <w:tcPr>
-            <w:tcW w:type="dxa" w:w="4106"/>
-            <w:tcBorders>
-              <w:top w:val="single" w:color="D8DBE3" w:sz="6"/>
-              <w:left w:val="single" w:color="D8DBE3" w:sz="6"/>
-              <w:bottom w:val="single" w:color="D8DBE3" w:sz="6"/>
-              <w:right w:val="single" w:color="D8DBE3" w:sz="6"/>
-            </w:tcBorders>
-            <w:tcMar>
-              <w:top w:type="dxa" w:w="70"/>
-              <w:left w:type="dxa" w:w="110"/>
-              <w:bottom w:type="dxa" w:w="70"/>
-              <w:right w:type="dxa" w:w="110"/>
-            </w:tcMar>
-          </w:tcPr>
-          <w:p>
-            <w:r>
-              <w:t xml:space="preserve">Read / send chat messages</w:t>
+            <w:tcW w:type="dxa" w:w="3628"/>
+            <w:tcBorders>
+              <w:top w:val="single" w:color="D8DBE3" w:sz="6"/>
+              <w:left w:val="single" w:color="D8DBE3" w:sz="6"/>
+              <w:bottom w:val="single" w:color="D8DBE3" w:sz="6"/>
+              <w:right w:val="single" w:color="D8DBE3" w:sz="6"/>
+            </w:tcBorders>
+            <w:tcMar>
+              <w:top w:type="dxa" w:w="70"/>
+              <w:left w:type="dxa" w:w="110"/>
+              <w:bottom w:type="dxa" w:w="70"/>
+              <w:right w:type="dxa" w:w="110"/>
+            </w:tcMar>
+          </w:tcPr>
+          <w:p>
+            <w:pPr>
+              <w:keepNext/>
+              <w:keepLines/>
+            </w:pPr>
+            <w:r>
+              <w:rPr>
+                <w:rFonts w:ascii="Consolas" w:cs="Consolas" w:eastAsia="Consolas" w:hAnsi="Consolas"/>
+                <w:color w:val="7C3AED"/>
+                <w:sz w:val="17"/>
+                <w:szCs w:val="17"/>
+              </w:rPr>
+              <w:t xml:space="preserve">{"userName": "alice", "message": "hi"}</w:t>
+            </w:r>
+          </w:p>
+        </w:tc>
+        <w:tc>
+          <w:tcPr>
+            <w:tcW w:type="dxa" w:w="1630"/>
+            <w:tcBorders>
+              <w:top w:val="single" w:color="D8DBE3" w:sz="6"/>
+              <w:left w:val="single" w:color="D8DBE3" w:sz="6"/>
+              <w:bottom w:val="single" w:color="D8DBE3" w:sz="6"/>
+              <w:right w:val="single" w:color="D8DBE3" w:sz="6"/>
+            </w:tcBorders>
+            <w:tcMar>
+              <w:top w:type="dxa" w:w="70"/>
+              <w:left w:type="dxa" w:w="110"/>
+              <w:bottom w:type="dxa" w:w="70"/>
+              <w:right w:type="dxa" w:w="110"/>
+            </w:tcMar>
+          </w:tcPr>
+          <w:p>
+            <w:pPr>
+              <w:keepNext/>
+              <w:keepLines/>
+            </w:pPr>
+            <w:r>
+              <w:rPr>
+                <w:sz w:val="17"/>
+                <w:szCs w:val="17"/>
+              </w:rPr>
+              <w:t xml:space="preserve">Send a chat message.</w:t>
+            </w:r>
+          </w:p>
+        </w:tc>
+      </w:tr>
+      <w:tr>
+        <w:trPr>
+          <w:cantSplit/>
+          <w:tblHeader w:val="off"/>
+        </w:trPr>
+        <w:tc>
+          <w:tcPr>
+            <w:tcW w:type="dxa" w:w="772"/>
+            <w:tcBorders>
+              <w:top w:val="single" w:color="D8DBE3" w:sz="6"/>
+              <w:left w:val="single" w:color="D8DBE3" w:sz="6"/>
+              <w:bottom w:val="single" w:color="D8DBE3" w:sz="6"/>
+              <w:right w:val="single" w:color="D8DBE3" w:sz="6"/>
+            </w:tcBorders>
+            <w:tcMar>
+              <w:top w:type="dxa" w:w="70"/>
+              <w:left w:type="dxa" w:w="110"/>
+              <w:bottom w:type="dxa" w:w="70"/>
+              <w:right w:type="dxa" w:w="110"/>
+            </w:tcMar>
+          </w:tcPr>
+          <w:p>
+            <w:pPr>
+              <w:keepNext w:val="false"/>
+              <w:keepLines/>
+            </w:pPr>
+            <w:r>
+              <w:rPr>
+                <w:sz w:val="17"/>
+                <w:szCs w:val="17"/>
+              </w:rPr>
+              <w:t xml:space="preserve">GET</w:t>
+            </w:r>
+          </w:p>
+        </w:tc>
+        <w:tc>
+          <w:tcPr>
+            <w:tcW w:type="dxa" w:w="2276"/>
+            <w:tcBorders>
+              <w:top w:val="single" w:color="D8DBE3" w:sz="6"/>
+              <w:left w:val="single" w:color="D8DBE3" w:sz="6"/>
+              <w:bottom w:val="single" w:color="D8DBE3" w:sz="6"/>
+              <w:right w:val="single" w:color="D8DBE3" w:sz="6"/>
+            </w:tcBorders>
+            <w:tcMar>
+              <w:top w:type="dxa" w:w="70"/>
+              <w:left w:type="dxa" w:w="110"/>
+              <w:bottom w:type="dxa" w:w="70"/>
+              <w:right w:type="dxa" w:w="110"/>
+            </w:tcMar>
+          </w:tcPr>
+          <w:p>
+            <w:pPr>
+              <w:keepNext w:val="false"/>
+              <w:keepLines/>
+            </w:pPr>
+            <w:r>
+              <w:rPr>
+                <w:rFonts w:ascii="Consolas" w:cs="Consolas" w:eastAsia="Consolas" w:hAnsi="Consolas"/>
+                <w:color w:val="7C3AED"/>
+                <w:sz w:val="17"/>
+                <w:szCs w:val="17"/>
+              </w:rPr>
+              <w:t xml:space="preserve">/chat</w:t>
+            </w:r>
+          </w:p>
+        </w:tc>
+        <w:tc>
+          <w:tcPr>
+            <w:tcW w:type="dxa" w:w="3628"/>
+            <w:tcBorders>
+              <w:top w:val="single" w:color="D8DBE3" w:sz="6"/>
+              <w:left w:val="single" w:color="D8DBE3" w:sz="6"/>
+              <w:bottom w:val="single" w:color="D8DBE3" w:sz="6"/>
+              <w:right w:val="single" w:color="D8DBE3" w:sz="6"/>
+            </w:tcBorders>
+            <w:tcMar>
+              <w:top w:type="dxa" w:w="70"/>
+              <w:left w:type="dxa" w:w="110"/>
+              <w:bottom w:type="dxa" w:w="70"/>
+              <w:right w:type="dxa" w:w="110"/>
+            </w:tcMar>
+          </w:tcPr>
+          <w:p>
+            <w:pPr>
+              <w:keepNext w:val="false"/>
+              <w:keepLines/>
+            </w:pPr>
+            <w:r>
+              <w:rPr>
+                <w:sz w:val="17"/>
+                <w:szCs w:val="17"/>
+              </w:rPr>
+              <w:t xml:space="preserve">-</w:t>
+            </w:r>
+          </w:p>
+        </w:tc>
+        <w:tc>
+          <w:tcPr>
+            <w:tcW w:type="dxa" w:w="1630"/>
+            <w:tcBorders>
+              <w:top w:val="single" w:color="D8DBE3" w:sz="6"/>
+              <w:left w:val="single" w:color="D8DBE3" w:sz="6"/>
+              <w:bottom w:val="single" w:color="D8DBE3" w:sz="6"/>
+              <w:right w:val="single" w:color="D8DBE3" w:sz="6"/>
+            </w:tcBorders>
+            <w:tcMar>
+              <w:top w:type="dxa" w:w="70"/>
+              <w:left w:type="dxa" w:w="110"/>
+              <w:bottom w:type="dxa" w:w="70"/>
+              <w:right w:type="dxa" w:w="110"/>
+            </w:tcMar>
+          </w:tcPr>
+          <w:p>
+            <w:pPr>
+              <w:keepNext w:val="false"/>
+              <w:keepLines/>
+            </w:pPr>
+            <w:r>
+              <w:rPr>
+                <w:sz w:val="17"/>
+                <w:szCs w:val="17"/>
+              </w:rPr>
+              <w:t xml:space="preserve">Chat messages.</w:t>
             </w:r>
           </w:p>
         </w:tc>
@@ -2404,7 +3451,139 @@
     </w:tbl>
     <w:p>
       <w:pPr>
+        <w:spacing w:after="80"/>
+      </w:pPr>
+    </w:p>
+    <w:p>
+      <w:pPr>
+        <w:keepLines/>
+        <w:spacing w:after="120"/>
+      </w:pPr>
+      <w:r>
+        <w:t xml:space="preserve">The browser sends each request to </w:t>
+      </w:r>
+      <w:r>
+        <w:rPr>
+          <w:rFonts w:ascii="Consolas" w:cs="Consolas" w:eastAsia="Consolas" w:hAnsi="Consolas"/>
+          <w:color w:val="7C3AED"/>
+          <w:sz w:val="19"/>
+          <w:szCs w:val="19"/>
+        </w:rPr>
+        <w:t xml:space="preserve">http://localhost:5173/guessmarket/...</w:t>
+      </w:r>
+      <w:r>
+        <w:t xml:space="preserve">, and the web client's server forwards it unchanged to </w:t>
+      </w:r>
+      <w:r>
+        <w:rPr>
+          <w:rFonts w:ascii="Consolas" w:cs="Consolas" w:eastAsia="Consolas" w:hAnsi="Consolas"/>
+          <w:color w:val="7C3AED"/>
+          <w:sz w:val="19"/>
+          <w:szCs w:val="19"/>
+        </w:rPr>
+        <w:t xml:space="preserve">http://localhost:8080/guessmarket/...</w:t>
+      </w:r>
+      <w:r>
+        <w:t xml:space="preserve"> - the same base URL the JavaFX client uses.</w:t>
+      </w:r>
+    </w:p>
+    <w:p>
+      <w:pPr>
+        <w:keepLines/>
+        <w:spacing w:after="120"/>
+      </w:pPr>
+      <w:r>
+        <w:t xml:space="preserve">Every response is JSON. A failed request returns </w:t>
+      </w:r>
+      <w:r>
+        <w:rPr>
+          <w:rFonts w:ascii="Consolas" w:cs="Consolas" w:eastAsia="Consolas" w:hAnsi="Consolas"/>
+          <w:color w:val="7C3AED"/>
+          <w:sz w:val="19"/>
+          <w:szCs w:val="19"/>
+        </w:rPr>
+        <w:t xml:space="preserve">{"error": "..."}</w:t>
+      </w:r>
+      <w:r>
+        <w:t xml:space="preserve"> with HTTP 400 for a validation error or HTTP 500 for an unexpected one, and the web client shows that message in its error dialog. </w:t>
+      </w:r>
+      <w:r>
+        <w:rPr>
+          <w:rFonts w:ascii="Consolas" w:cs="Consolas" w:eastAsia="Consolas" w:hAnsi="Consolas"/>
+          <w:color w:val="7C3AED"/>
+          <w:sz w:val="19"/>
+          <w:szCs w:val="19"/>
+        </w:rPr>
+        <w:t xml:space="preserve">commissionType</w:t>
+      </w:r>
+      <w:r>
+        <w:t xml:space="preserve"> is </w:t>
+      </w:r>
+      <w:r>
+        <w:rPr>
+          <w:rFonts w:ascii="Consolas" w:cs="Consolas" w:eastAsia="Consolas" w:hAnsi="Consolas"/>
+          <w:color w:val="7C3AED"/>
+          <w:sz w:val="19"/>
+          <w:szCs w:val="19"/>
+        </w:rPr>
+        <w:t xml:space="preserve">ON_PURCHASE</w:t>
+      </w:r>
+      <w:r>
+        <w:t xml:space="preserve"> or </w:t>
+      </w:r>
+      <w:r>
+        <w:rPr>
+          <w:rFonts w:ascii="Consolas" w:cs="Consolas" w:eastAsia="Consolas" w:hAnsi="Consolas"/>
+          <w:color w:val="7C3AED"/>
+          <w:sz w:val="19"/>
+          <w:szCs w:val="19"/>
+        </w:rPr>
+        <w:t xml:space="preserve">ON_CLOSE</w:t>
+      </w:r>
+      <w:r>
+        <w:t xml:space="preserve">; </w:t>
+      </w:r>
+      <w:r>
+        <w:rPr>
+          <w:rFonts w:ascii="Consolas" w:cs="Consolas" w:eastAsia="Consolas" w:hAnsi="Consolas"/>
+          <w:color w:val="7C3AED"/>
+          <w:sz w:val="19"/>
+          <w:szCs w:val="19"/>
+        </w:rPr>
+        <w:t xml:space="preserve">side</w:t>
+      </w:r>
+      <w:r>
+        <w:t xml:space="preserve"> is </w:t>
+      </w:r>
+      <w:r>
+        <w:rPr>
+          <w:rFonts w:ascii="Consolas" w:cs="Consolas" w:eastAsia="Consolas" w:hAnsi="Consolas"/>
+          <w:color w:val="7C3AED"/>
+          <w:sz w:val="19"/>
+          <w:szCs w:val="19"/>
+        </w:rPr>
+        <w:t xml:space="preserve">BUY</w:t>
+      </w:r>
+      <w:r>
+        <w:t xml:space="preserve"> or </w:t>
+      </w:r>
+      <w:r>
+        <w:rPr>
+          <w:rFonts w:ascii="Consolas" w:cs="Consolas" w:eastAsia="Consolas" w:hAnsi="Consolas"/>
+          <w:color w:val="7C3AED"/>
+          <w:sz w:val="19"/>
+          <w:szCs w:val="19"/>
+        </w:rPr>
+        <w:t xml:space="preserve">SELL</w:t>
+      </w:r>
+      <w:r>
+        <w:t xml:space="preserve">.</w:t>
+      </w:r>
+    </w:p>
+    <w:p>
+      <w:pPr>
         <w:pStyle w:val="Heading1"/>
+        <w:pageBreakBefore/>
       </w:pPr>
       <w:r>
         <w:t xml:space="preserve">Design Choices and Assumptions</w:t>
@@ -2420,6 +3599,7 @@
     </w:p>
     <w:p>
       <w:pPr>
+        <w:keepLines/>
         <w:spacing w:after="120"/>
       </w:pPr>
       <w:r>
@@ -2436,6 +3616,7 @@
     </w:p>
     <w:p>
       <w:pPr>
+        <w:keepLines/>
         <w:spacing w:after="120"/>
       </w:pPr>
       <w:r>
@@ -2452,10 +3633,11 @@
     </w:p>
     <w:p>
       <w:pPr>
+        <w:keepLines/>
         <w:spacing w:after="120"/>
       </w:pPr>
       <w:r>
-        <w:t xml:space="preserve">The client asks the server for the full current picture - events, users, chat, and the details of whatever event is open - once a second, the same pull approach and rate as the JavaFX client (the specification allows up to two seconds).</w:t>
+        <w:t xml:space="preserve">The client asks the server for the full current picture - events, users, chat, and the details of whatever event is open - once a second, the same pull approach and rate as the JavaFX client (the specification allows up to two seconds). A new request is only sent once the previous answer has arrived, so a busy server never gets a pile-up of overlapping requests.</w:t>
       </w:r>
     </w:p>
     <w:p>
@@ -2468,6 +3650,7 @@
     </w:p>
     <w:p>
       <w:pPr>
+        <w:keepLines/>
         <w:spacing w:after="120"/>
       </w:pPr>
       <w:r>
@@ -2484,6 +3667,7 @@
     </w:p>
     <w:p>
       <w:pPr>
+        <w:keepLines/>
         <w:spacing w:after="120"/>
       </w:pPr>
       <w:r>
@@ -2500,6 +3684,7 @@
     </w:p>
     <w:p>
       <w:pPr>
+        <w:keepLines/>
         <w:spacing w:after="120"/>
       </w:pPr>
       <w:r>
@@ -2516,6 +3701,7 @@
     </w:p>
     <w:p>
       <w:pPr>
+        <w:keepLines/>
         <w:spacing w:after="120"/>
       </w:pPr>
       <w:r>
@@ -2532,6 +3718,7 @@
     </w:p>
     <w:p>
       <w:pPr>
+        <w:keepLines/>
         <w:spacing w:after="120"/>
       </w:pPr>
       <w:r>
@@ -2541,6 +3728,7 @@
     <w:p>
       <w:pPr>
         <w:pStyle w:val="Heading1"/>
+        <w:pageBreakBefore/>
       </w:pPr>
       <w:r>
         <w:t xml:space="preserve">Main Files</w:t>
@@ -2548,6 +3736,7 @@
     </w:p>
     <w:p>
       <w:pPr>
+        <w:keepLines/>
         <w:spacing w:after="120"/>
       </w:pPr>
       <w:r>
@@ -2597,6 +3786,7 @@
       </w:tblGrid>
       <w:tr>
         <w:trPr>
+          <w:cantSplit/>
           <w:tblHeader/>
         </w:trPr>
         <w:tc>
@@ -2617,6 +3807,10 @@
             </w:tcMar>
           </w:tcPr>
           <w:p>
+            <w:pPr>
+              <w:keepNext/>
+              <w:keepLines/>
+            </w:pPr>
             <w:r>
               <w:rPr>
                 <w:b/>
@@ -2645,6 +3839,10 @@
             </w:tcMar>
           </w:tcPr>
           <w:p>
+            <w:pPr>
+              <w:keepNext/>
+              <w:keepLines/>
+            </w:pPr>
             <w:r>
               <w:rPr>
                 <w:b/>
@@ -2673,6 +3871,10 @@
             </w:tcMar>
           </w:tcPr>
           <w:p>
+            <w:pPr>
+              <w:keepNext/>
+              <w:keepLines/>
+            </w:pPr>
             <w:r>
               <w:rPr>
                 <w:b/>
@@ -2686,6 +3888,7 @@
       </w:tr>
       <w:tr>
         <w:trPr>
+          <w:cantSplit/>
           <w:tblHeader w:val="off"/>
         </w:trPr>
         <w:tc>
@@ -2705,6 +3908,10 @@
             </w:tcMar>
           </w:tcPr>
           <w:p>
+            <w:pPr>
+              <w:keepNext/>
+              <w:keepLines/>
+            </w:pPr>
             <w:r>
               <w:rPr>
                 <w:rFonts w:ascii="Consolas" w:cs="Consolas" w:eastAsia="Consolas" w:hAnsi="Consolas"/>
@@ -2733,6 +3940,10 @@
             </w:tcMar>
           </w:tcPr>
           <w:p>
+            <w:pPr>
+              <w:keepNext/>
+              <w:keepLines/>
+            </w:pPr>
             <w:r>
               <w:t xml:space="preserve">Checks Node.js, installs, starts the client</w:t>
             </w:r>
@@ -2755,6 +3966,10 @@
             </w:tcMar>
           </w:tcPr>
           <w:p>
+            <w:pPr>
+              <w:keepNext/>
+              <w:keepLines/>
+            </w:pPr>
             <w:r>
               <w:rPr>
                 <w:rFonts w:ascii="Consolas" w:cs="Consolas" w:eastAsia="Consolas" w:hAnsi="Consolas"/>
@@ -2769,6 +3984,7 @@
       </w:tr>
       <w:tr>
         <w:trPr>
+          <w:cantSplit/>
           <w:tblHeader w:val="off"/>
         </w:trPr>
         <w:tc>
@@ -2788,6 +4004,10 @@
             </w:tcMar>
           </w:tcPr>
           <w:p>
+            <w:pPr>
+              <w:keepNext/>
+              <w:keepLines/>
+            </w:pPr>
             <w:r>
               <w:rPr>
                 <w:rFonts w:ascii="Consolas" w:cs="Consolas" w:eastAsia="Consolas" w:hAnsi="Consolas"/>
@@ -2816,6 +4036,10 @@
             </w:tcMar>
           </w:tcPr>
           <w:p>
+            <w:pPr>
+              <w:keepNext/>
+              <w:keepLines/>
+            </w:pPr>
             <w:r>
               <w:t xml:space="preserve">Libraries (React, Vite) and the start command</w:t>
             </w:r>
@@ -2838,6 +4062,10 @@
             </w:tcMar>
           </w:tcPr>
           <w:p>
+            <w:pPr>
+              <w:keepNext/>
+              <w:keepLines/>
+            </w:pPr>
             <w:r>
               <w:t xml:space="preserve">Jars on the classpath</w:t>
             </w:r>
@@ -2846,6 +4074,7 @@
       </w:tr>
       <w:tr>
         <w:trPr>
+          <w:cantSplit/>
           <w:tblHeader w:val="off"/>
         </w:trPr>
         <w:tc>
@@ -2865,6 +4094,10 @@
             </w:tcMar>
           </w:tcPr>
           <w:p>
+            <w:pPr>
+              <w:keepNext/>
+              <w:keepLines/>
+            </w:pPr>
             <w:r>
               <w:rPr>
                 <w:rFonts w:ascii="Consolas" w:cs="Consolas" w:eastAsia="Consolas" w:hAnsi="Consolas"/>
@@ -2893,6 +4126,10 @@
             </w:tcMar>
           </w:tcPr>
           <w:p>
+            <w:pPr>
+              <w:keepNext/>
+              <w:keepLines/>
+            </w:pPr>
             <w:r>
               <w:t xml:space="preserve">Port 5173 and forwarding </w:t>
             </w:r>
@@ -2927,6 +4164,10 @@
             </w:tcMar>
           </w:tcPr>
           <w:p>
+            <w:pPr>
+              <w:keepNext/>
+              <w:keepLines/>
+            </w:pPr>
             <w:r>
               <w:t xml:space="preserve">-</w:t>
             </w:r>
@@ -2935,6 +4176,7 @@
       </w:tr>
       <w:tr>
         <w:trPr>
+          <w:cantSplit/>
           <w:tblHeader w:val="off"/>
         </w:trPr>
         <w:tc>
@@ -2954,6 +4196,10 @@
             </w:tcMar>
           </w:tcPr>
           <w:p>
+            <w:pPr>
+              <w:keepNext/>
+              <w:keepLines/>
+            </w:pPr>
             <w:r>
               <w:rPr>
                 <w:rFonts w:ascii="Consolas" w:cs="Consolas" w:eastAsia="Consolas" w:hAnsi="Consolas"/>
@@ -2994,6 +4240,10 @@
             </w:tcMar>
           </w:tcPr>
           <w:p>
+            <w:pPr>
+              <w:keepNext/>
+              <w:keepLines/>
+            </w:pPr>
             <w:r>
               <w:t xml:space="preserve">The page and its entry point</w:t>
             </w:r>
@@ -3016,6 +4266,10 @@
             </w:tcMar>
           </w:tcPr>
           <w:p>
+            <w:pPr>
+              <w:keepNext/>
+              <w:keepLines/>
+            </w:pPr>
             <w:r>
               <w:rPr>
                 <w:rFonts w:ascii="Consolas" w:cs="Consolas" w:eastAsia="Consolas" w:hAnsi="Consolas"/>
@@ -3030,6 +4284,7 @@
       </w:tr>
       <w:tr>
         <w:trPr>
+          <w:cantSplit/>
           <w:tblHeader w:val="off"/>
         </w:trPr>
         <w:tc>
@@ -3049,6 +4304,10 @@
             </w:tcMar>
           </w:tcPr>
           <w:p>
+            <w:pPr>
+              <w:keepNext/>
+              <w:keepLines/>
+            </w:pPr>
             <w:r>
               <w:rPr>
                 <w:rFonts w:ascii="Consolas" w:cs="Consolas" w:eastAsia="Consolas" w:hAnsi="Consolas"/>
@@ -3077,6 +4336,10 @@
             </w:tcMar>
           </w:tcPr>
           <w:p>
+            <w:pPr>
+              <w:keepNext/>
+              <w:keepLines/>
+            </w:pPr>
             <w:r>
               <w:t xml:space="preserve">Login vs main screen; tabs; polling; error dialog</w:t>
             </w:r>
@@ -3099,6 +4362,10 @@
             </w:tcMar>
           </w:tcPr>
           <w:p>
+            <w:pPr>
+              <w:keepNext/>
+              <w:keepLines/>
+            </w:pPr>
             <w:r>
               <w:rPr>
                 <w:rFonts w:ascii="Consolas" w:cs="Consolas" w:eastAsia="Consolas" w:hAnsi="Consolas"/>
@@ -3116,6 +4383,7 @@
       </w:tr>
       <w:tr>
         <w:trPr>
+          <w:cantSplit/>
           <w:tblHeader w:val="off"/>
         </w:trPr>
         <w:tc>
@@ -3135,6 +4403,10 @@
             </w:tcMar>
           </w:tcPr>
           <w:p>
+            <w:pPr>
+              <w:keepNext/>
+              <w:keepLines/>
+            </w:pPr>
             <w:r>
               <w:rPr>
                 <w:rFonts w:ascii="Consolas" w:cs="Consolas" w:eastAsia="Consolas" w:hAnsi="Consolas"/>
@@ -3163,6 +4435,10 @@
             </w:tcMar>
           </w:tcPr>
           <w:p>
+            <w:pPr>
+              <w:keepNext/>
+              <w:keepLines/>
+            </w:pPr>
             <w:r>
               <w:t xml:space="preserve">Every call to the server</w:t>
             </w:r>
@@ -3185,6 +4461,10 @@
             </w:tcMar>
           </w:tcPr>
           <w:p>
+            <w:pPr>
+              <w:keepNext/>
+              <w:keepLines/>
+            </w:pPr>
             <w:r>
               <w:rPr>
                 <w:rFonts w:ascii="Consolas" w:cs="Consolas" w:eastAsia="Consolas" w:hAnsi="Consolas"/>
@@ -3199,6 +4479,7 @@
       </w:tr>
       <w:tr>
         <w:trPr>
+          <w:cantSplit/>
           <w:tblHeader w:val="off"/>
         </w:trPr>
         <w:tc>
@@ -3218,6 +4499,10 @@
             </w:tcMar>
           </w:tcPr>
           <w:p>
+            <w:pPr>
+              <w:keepNext/>
+              <w:keepLines/>
+            </w:pPr>
             <w:r>
               <w:rPr>
                 <w:rFonts w:ascii="Consolas" w:cs="Consolas" w:eastAsia="Consolas" w:hAnsi="Consolas"/>
@@ -3246,8 +4531,12 @@
             </w:tcMar>
           </w:tcPr>
           <w:p>
-            <w:r>
-              <w:t xml:space="preserve">Call the server every second, keep the latest answer</w:t>
+            <w:pPr>
+              <w:keepNext/>
+              <w:keepLines/>
+            </w:pPr>
+            <w:r>
+              <w:t xml:space="preserve">Ask the server again one second after each answer</w:t>
             </w:r>
           </w:p>
         </w:tc>
@@ -3268,6 +4557,10 @@
             </w:tcMar>
           </w:tcPr>
           <w:p>
+            <w:pPr>
+              <w:keepNext/>
+              <w:keepLines/>
+            </w:pPr>
             <w:r>
               <w:t xml:space="preserve">The polling </w:t>
             </w:r>
@@ -3285,6 +4578,7 @@
       </w:tr>
       <w:tr>
         <w:trPr>
+          <w:cantSplit/>
           <w:tblHeader w:val="off"/>
         </w:trPr>
         <w:tc>
@@ -3304,6 +4598,10 @@
             </w:tcMar>
           </w:tcPr>
           <w:p>
+            <w:pPr>
+              <w:keepNext/>
+              <w:keepLines/>
+            </w:pPr>
             <w:r>
               <w:rPr>
                 <w:rFonts w:ascii="Consolas" w:cs="Consolas" w:eastAsia="Consolas" w:hAnsi="Consolas"/>
@@ -3332,6 +4630,10 @@
             </w:tcMar>
           </w:tcPr>
           <w:p>
+            <w:pPr>
+              <w:keepNext/>
+              <w:keepLines/>
+            </w:pPr>
             <w:r>
               <w:t xml:space="preserve">Login screen</w:t>
             </w:r>
@@ -3354,6 +4656,10 @@
             </w:tcMar>
           </w:tcPr>
           <w:p>
+            <w:pPr>
+              <w:keepNext/>
+              <w:keepLines/>
+            </w:pPr>
             <w:r>
               <w:rPr>
                 <w:rFonts w:ascii="Consolas" w:cs="Consolas" w:eastAsia="Consolas" w:hAnsi="Consolas"/>
@@ -3380,6 +4686,7 @@
       </w:tr>
       <w:tr>
         <w:trPr>
+          <w:cantSplit/>
           <w:tblHeader w:val="off"/>
         </w:trPr>
         <w:tc>
@@ -3399,6 +4706,10 @@
             </w:tcMar>
           </w:tcPr>
           <w:p>
+            <w:pPr>
+              <w:keepNext/>
+              <w:keepLines/>
+            </w:pPr>
             <w:r>
               <w:rPr>
                 <w:rFonts w:ascii="Consolas" w:cs="Consolas" w:eastAsia="Consolas" w:hAnsi="Consolas"/>
@@ -3427,6 +4738,10 @@
             </w:tcMar>
           </w:tcPr>
           <w:p>
+            <w:pPr>
+              <w:keepNext/>
+              <w:keepLines/>
+            </w:pPr>
             <w:r>
               <w:t xml:space="preserve">Filters and the event list</w:t>
             </w:r>
@@ -3449,6 +4764,10 @@
             </w:tcMar>
           </w:tcPr>
           <w:p>
+            <w:pPr>
+              <w:keepNext/>
+              <w:keepLines/>
+            </w:pPr>
             <w:r>
               <w:t xml:space="preserve">Events tab</w:t>
             </w:r>
@@ -3457,6 +4776,7 @@
       </w:tr>
       <w:tr>
         <w:trPr>
+          <w:cantSplit/>
           <w:tblHeader w:val="off"/>
         </w:trPr>
         <w:tc>
@@ -3476,6 +4796,10 @@
             </w:tcMar>
           </w:tcPr>
           <w:p>
+            <w:pPr>
+              <w:keepNext/>
+              <w:keepLines/>
+            </w:pPr>
             <w:r>
               <w:rPr>
                 <w:rFonts w:ascii="Consolas" w:cs="Consolas" w:eastAsia="Consolas" w:hAnsi="Consolas"/>
@@ -3504,6 +4828,10 @@
             </w:tcMar>
           </w:tcPr>
           <w:p>
+            <w:pPr>
+              <w:keepNext/>
+              <w:keepLines/>
+            </w:pPr>
             <w:r>
               <w:t xml:space="preserve">LMSR and Order Book event views, read-only or with trading</w:t>
             </w:r>
@@ -3526,6 +4854,10 @@
             </w:tcMar>
           </w:tcPr>
           <w:p>
+            <w:pPr>
+              <w:keepNext/>
+              <w:keepLines/>
+            </w:pPr>
             <w:r>
               <w:rPr>
                 <w:rFonts w:ascii="Consolas" w:cs="Consolas" w:eastAsia="Consolas" w:hAnsi="Consolas"/>
@@ -3552,6 +4884,7 @@
       </w:tr>
       <w:tr>
         <w:trPr>
+          <w:cantSplit/>
           <w:tblHeader w:val="off"/>
         </w:trPr>
         <w:tc>
@@ -3571,6 +4904,10 @@
             </w:tcMar>
           </w:tcPr>
           <w:p>
+            <w:pPr>
+              <w:keepNext/>
+              <w:keepLines/>
+            </w:pPr>
             <w:r>
               <w:rPr>
                 <w:rFonts w:ascii="Consolas" w:cs="Consolas" w:eastAsia="Consolas" w:hAnsi="Consolas"/>
@@ -3599,6 +4936,10 @@
             </w:tcMar>
           </w:tcPr>
           <w:p>
+            <w:pPr>
+              <w:keepNext/>
+              <w:keepLines/>
+            </w:pPr>
             <w:r>
               <w:t xml:space="preserve">Users, account, deposit, history, participation, trading</w:t>
             </w:r>
@@ -3621,6 +4962,10 @@
             </w:tcMar>
           </w:tcPr>
           <w:p>
+            <w:pPr>
+              <w:keepNext/>
+              <w:keepLines/>
+            </w:pPr>
             <w:r>
               <w:t xml:space="preserve">Account tab</w:t>
             </w:r>
@@ -3629,6 +4974,7 @@
       </w:tr>
       <w:tr>
         <w:trPr>
+          <w:cantSplit/>
           <w:tblHeader w:val="off"/>
         </w:trPr>
         <w:tc>
@@ -3648,6 +4994,10 @@
             </w:tcMar>
           </w:tcPr>
           <w:p>
+            <w:pPr>
+              <w:keepNext/>
+              <w:keepLines/>
+            </w:pPr>
             <w:r>
               <w:rPr>
                 <w:rFonts w:ascii="Consolas" w:cs="Consolas" w:eastAsia="Consolas" w:hAnsi="Consolas"/>
@@ -3676,6 +5026,10 @@
             </w:tcMar>
           </w:tcPr>
           <w:p>
+            <w:pPr>
+              <w:keepNext/>
+              <w:keepLines/>
+            </w:pPr>
             <w:r>
               <w:t xml:space="preserve">Create Event form</w:t>
             </w:r>
@@ -3698,6 +5052,10 @@
             </w:tcMar>
           </w:tcPr>
           <w:p>
+            <w:pPr>
+              <w:keepNext/>
+              <w:keepLines/>
+            </w:pPr>
             <w:r>
               <w:t xml:space="preserve">Create Event dialog</w:t>
             </w:r>
@@ -3706,6 +5064,7 @@
       </w:tr>
       <w:tr>
         <w:trPr>
+          <w:cantSplit/>
           <w:tblHeader w:val="off"/>
         </w:trPr>
         <w:tc>
@@ -3725,6 +5084,10 @@
             </w:tcMar>
           </w:tcPr>
           <w:p>
+            <w:pPr>
+              <w:keepNext/>
+              <w:keepLines/>
+            </w:pPr>
             <w:r>
               <w:rPr>
                 <w:rFonts w:ascii="Consolas" w:cs="Consolas" w:eastAsia="Consolas" w:hAnsi="Consolas"/>
@@ -3753,6 +5116,10 @@
             </w:tcMar>
           </w:tcPr>
           <w:p>
+            <w:pPr>
+              <w:keepNext/>
+              <w:keepLines/>
+            </w:pPr>
             <w:r>
               <w:t xml:space="preserve">Chat</w:t>
             </w:r>
@@ -3775,6 +5142,10 @@
             </w:tcMar>
           </w:tcPr>
           <w:p>
+            <w:pPr>
+              <w:keepNext/>
+              <w:keepLines/>
+            </w:pPr>
             <w:r>
               <w:t xml:space="preserve">Chat tab</w:t>
             </w:r>
@@ -3783,6 +5154,7 @@
       </w:tr>
       <w:tr>
         <w:trPr>
+          <w:cantSplit/>
           <w:tblHeader w:val="off"/>
         </w:trPr>
         <w:tc>
@@ -3802,6 +5174,10 @@
             </w:tcMar>
           </w:tcPr>
           <w:p>
+            <w:pPr>
+              <w:keepNext/>
+              <w:keepLines/>
+            </w:pPr>
             <w:r>
               <w:rPr>
                 <w:rFonts w:ascii="Consolas" w:cs="Consolas" w:eastAsia="Consolas" w:hAnsi="Consolas"/>
@@ -3830,6 +5206,10 @@
             </w:tcMar>
           </w:tcPr>
           <w:p>
+            <w:pPr>
+              <w:keepNext/>
+              <w:keepLines/>
+            </w:pPr>
             <w:r>
               <w:t xml:space="preserve">Number field with arrows and clamping</w:t>
             </w:r>
@@ -3852,6 +5232,10 @@
             </w:tcMar>
           </w:tcPr>
           <w:p>
+            <w:pPr>
+              <w:keepNext/>
+              <w:keepLines/>
+            </w:pPr>
             <w:r>
               <w:rPr>
                 <w:rFonts w:ascii="Consolas" w:cs="Consolas" w:eastAsia="Consolas" w:hAnsi="Consolas"/>
@@ -3866,6 +5250,7 @@
       </w:tr>
       <w:tr>
         <w:trPr>
+          <w:cantSplit/>
           <w:tblHeader w:val="off"/>
         </w:trPr>
         <w:tc>
@@ -3885,6 +5270,10 @@
             </w:tcMar>
           </w:tcPr>
           <w:p>
+            <w:pPr>
+              <w:keepNext/>
+              <w:keepLines/>
+            </w:pPr>
             <w:r>
               <w:rPr>
                 <w:rFonts w:ascii="Consolas" w:cs="Consolas" w:eastAsia="Consolas" w:hAnsi="Consolas"/>
@@ -3913,6 +5302,10 @@
             </w:tcMar>
           </w:tcPr>
           <w:p>
+            <w:pPr>
+              <w:keepNext/>
+              <w:keepLines/>
+            </w:pPr>
             <w:r>
               <w:t xml:space="preserve">The error window</w:t>
             </w:r>
@@ -3935,6 +5328,10 @@
             </w:tcMar>
           </w:tcPr>
           <w:p>
+            <w:pPr>
+              <w:keepNext/>
+              <w:keepLines/>
+            </w:pPr>
             <w:r>
               <w:rPr>
                 <w:rFonts w:ascii="Consolas" w:cs="Consolas" w:eastAsia="Consolas" w:hAnsi="Consolas"/>
@@ -3949,6 +5346,7 @@
       </w:tr>
       <w:tr>
         <w:trPr>
+          <w:cantSplit/>
           <w:tblHeader w:val="off"/>
         </w:trPr>
         <w:tc>
@@ -3968,6 +5366,10 @@
             </w:tcMar>
           </w:tcPr>
           <w:p>
+            <w:pPr>
+              <w:keepNext w:val="false"/>
+              <w:keepLines/>
+            </w:pPr>
             <w:r>
               <w:rPr>
                 <w:rFonts w:ascii="Consolas" w:cs="Consolas" w:eastAsia="Consolas" w:hAnsi="Consolas"/>
@@ -3996,6 +5398,10 @@
             </w:tcMar>
           </w:tcPr>
           <w:p>
+            <w:pPr>
+              <w:keepNext w:val="false"/>
+              <w:keepLines/>
+            </w:pPr>
             <w:r>
               <w:t xml:space="preserve">All styling, using the JavaFX client's color tokens</w:t>
             </w:r>
@@ -4018,6 +5424,10 @@
             </w:tcMar>
           </w:tcPr>
           <w:p>
+            <w:pPr>
+              <w:keepNext w:val="false"/>
+              <w:keepLines/>
+            </w:pPr>
             <w:r>
               <w:rPr>
                 <w:rFonts w:ascii="Consolas" w:cs="Consolas" w:eastAsia="Consolas" w:hAnsi="Consolas"/>
@@ -4034,6 +5444,7 @@
     <w:p>
       <w:pPr>
         <w:pStyle w:val="Heading1"/>
+        <w:pageBreakBefore/>
       </w:pPr>
       <w:r>
         <w:t xml:space="preserve">Working with AI</w:t>
@@ -4041,31 +5452,64 @@
     </w:p>
     <w:p>
       <w:pPr>
-        <w:pStyle w:val="Heading2"/>
-      </w:pPr>
-      <w:r>
+        <w:keepNext/>
+        <w:keepLines/>
+        <w:spacing w:after="100" w:before="320"/>
+      </w:pPr>
+      <w:r>
+        <w:rPr>
+          <w:b/>
+          <w:bCs/>
+          <w:sz w:val="24"/>
+          <w:szCs w:val="24"/>
+        </w:rPr>
         <w:t xml:space="preserve">Which tool did you choose, and why? Did you try other tools?</w:t>
       </w:r>
     </w:p>
     <w:p>
       <w:pPr>
+        <w:keepNext/>
+        <w:keepLines/>
+        <w:spacing w:after="80"/>
+        <w:ind w:left="280"/>
+      </w:pPr>
+      <w:r>
+        <w:t xml:space="preserve">I used Claude Code, running inside the Antigravity editor - the same AI tool I worked with throughout the course. It works directly inside my project: it read my JavaFX client's code and my server's endpoints itself, so the web client was built to match what already existed rather than from my descriptions of it, and it could run the server, start the web client and test it in a real browser on its own.</w:t>
+      </w:r>
+    </w:p>
+    <w:p>
+      <w:pPr>
+        <w:keepNext w:val="false"/>
+        <w:keepLines/>
         <w:spacing w:after="120"/>
-      </w:pPr>
-      <w:r>
-        <w:t xml:space="preserve">I used Claude Code, running inside the Antigravity editor - the same AI tool I worked with throughout the course. It works directly inside my project: it read my JavaFX client's code and my server's endpoints itself, so the web client was built to match what already existed rather than from my descriptions of it, and it could run the server, start the web client and test it in a real browser on its own. For high-level structure and planning discussions I also used ChatGPT, but all of the actual development was done with Claude Code. I did not try GitHub Copilot for this exercise.</w:t>
-      </w:r>
-    </w:p>
-    <w:p>
-      <w:pPr>
-        <w:pStyle w:val="Heading2"/>
-      </w:pPr>
-      <w:r>
+        <w:ind w:left="280"/>
+      </w:pPr>
+      <w:r>
+        <w:t xml:space="preserve">For high-level structure and planning discussions I also used ChatGPT, but all of the actual development was done with Claude Code. I did not try GitHub Copilot for this exercise.</w:t>
+      </w:r>
+    </w:p>
+    <w:p>
+      <w:pPr>
+        <w:keepNext/>
+        <w:keepLines/>
+        <w:spacing w:after="100" w:before="320"/>
+      </w:pPr>
+      <w:r>
+        <w:rPr>
+          <w:b/>
+          <w:bCs/>
+          <w:sz w:val="24"/>
+          <w:szCs w:val="24"/>
+        </w:rPr>
         <w:t xml:space="preserve">Were there areas where the AI did not "deliver the goods" and you had to step in as a programmer?</w:t>
       </w:r>
     </w:p>
     <w:p>
       <w:pPr>
-        <w:spacing w:after="120"/>
+        <w:keepNext/>
+        <w:keepLines/>
+        <w:spacing w:after="80"/>
+        <w:ind w:left="280"/>
       </w:pPr>
       <w:r>
         <w:t xml:space="preserve">Yes - mainly in judgment calls, and in details only a person looking at the screen notices:</w:t>
@@ -4074,11 +5518,13 @@
     <w:p>
       <w:pPr>
         <w:pStyle w:val="ListParagraph"/>
+        <w:keepNext/>
+        <w:keepLines/>
         <w:numPr>
           <w:ilvl w:val="0"/>
-          <w:numId w:val="3"/>
+          <w:numId w:val="4"/>
         </w:numPr>
-        <w:spacing w:after="60"/>
+        <w:spacing w:after="80"/>
       </w:pPr>
       <w:r>
         <w:t xml:space="preserve">Its first recommendation (React with a separate Node.js process) came without explaining why it was needed. I kept asking - why can't the browser just call my server on port 8080? - until I understood the browser's same-origin rule and why a proxy was the only option that keeps the server untouched. Only then did we choose the stack.</w:t>
@@ -4087,11 +5533,13 @@
     <w:p>
       <w:pPr>
         <w:pStyle w:val="ListParagraph"/>
+        <w:keepNext/>
+        <w:keepLines/>
         <w:numPr>
           <w:ilvl w:val="0"/>
-          <w:numId w:val="3"/>
+          <w:numId w:val="4"/>
         </w:numPr>
-        <w:spacing w:after="60"/>
+        <w:spacing w:after="80"/>
       </w:pPr>
       <w:r>
         <w:t xml:space="preserve">Comparing it head-to-head with my JavaFX client, I noticed the number fields had no up/down arrows and handled bad input inconsistently (-3 and 0 gave two different error messages), unlike the JavaFX Spinners. I had it match the JavaFX behavior exactly.</w:t>
@@ -4100,11 +5548,13 @@
     <w:p>
       <w:pPr>
         <w:pStyle w:val="ListParagraph"/>
+        <w:keepNext/>
+        <w:keepLines/>
         <w:numPr>
           <w:ilvl w:val="0"/>
-          <w:numId w:val="3"/>
+          <w:numId w:val="4"/>
         </w:numPr>
-        <w:spacing w:after="60"/>
+        <w:spacing w:after="80"/>
       </w:pPr>
       <w:r>
         <w:t xml:space="preserve">I noticed the alternating row shading was too faint and that a selected row looked like just another stripe, and asked for a clearer selection color.</w:t>
@@ -4113,11 +5563,13 @@
     <w:p>
       <w:pPr>
         <w:pStyle w:val="ListParagraph"/>
+        <w:keepNext w:val="false"/>
+        <w:keepLines/>
         <w:numPr>
           <w:ilvl w:val="0"/>
-          <w:numId w:val="3"/>
+          <w:numId w:val="4"/>
         </w:numPr>
-        <w:spacing w:after="60"/>
+        <w:spacing w:after="120"/>
       </w:pPr>
       <w:r>
         <w:t xml:space="preserve">Scope decisions were mine: leave out XML upload, and add Create Event and Chat even though they were not required.</w:t>
@@ -4125,18 +5577,40 @@
     </w:p>
     <w:p>
       <w:pPr>
-        <w:pStyle w:val="Heading2"/>
-      </w:pPr>
-      <w:r>
+        <w:keepNext/>
+        <w:keepLines/>
+        <w:spacing w:after="100" w:before="320"/>
+      </w:pPr>
+      <w:r>
+        <w:rPr>
+          <w:b/>
+          <w:bCs/>
+          <w:sz w:val="24"/>
+          <w:szCs w:val="24"/>
+        </w:rPr>
         <w:t xml:space="preserve">Did you run into a bug or requirement that the AI simply could not develop?</w:t>
       </w:r>
     </w:p>
     <w:p>
       <w:pPr>
+        <w:keepNext/>
+        <w:keepLines/>
+        <w:spacing w:after="80"/>
+        <w:ind w:left="280"/>
+      </w:pPr>
+      <w:r>
+        <w:t xml:space="preserve">No - nothing it ultimately could not build. What it could not do on its own was judge how things look and feel; that needed me.</w:t>
+      </w:r>
+    </w:p>
+    <w:p>
+      <w:pPr>
+        <w:keepNext w:val="false"/>
+        <w:keepLines/>
         <w:spacing w:after="120"/>
-      </w:pPr>
-      <w:r>
-        <w:t xml:space="preserve">No - nothing it ultimately could not build. What it could not do on its own was judge how things look and feel; that needed me. On its own initiative it also caught problems I would not have thought of: the newest version of its build tool would not run on older Node.js versions, so it switched to one that does and made </w:t>
+        <w:ind w:left="280"/>
+      </w:pPr>
+      <w:r>
+        <w:t xml:space="preserve">On its own initiative it also caught problems I would not have thought of: the newest version of its build tool would not run on older Node.js versions, so it switched to one that does and made </w:t>
       </w:r>
       <w:r>
         <w:rPr>
@@ -4153,31 +5627,64 @@
     </w:p>
     <w:p>
       <w:pPr>
-        <w:pStyle w:val="Heading2"/>
-      </w:pPr>
-      <w:r>
+        <w:keepNext/>
+        <w:keepLines/>
+        <w:spacing w:after="100" w:before="320"/>
+      </w:pPr>
+      <w:r>
+        <w:rPr>
+          <w:b/>
+          <w:bCs/>
+          <w:sz w:val="24"/>
+          <w:szCs w:val="24"/>
+        </w:rPr>
         <w:t xml:space="preserve">How much of this client was developed by the AI alone, and how much needed your intervention and understanding?</w:t>
       </w:r>
     </w:p>
     <w:p>
       <w:pPr>
+        <w:keepNext/>
+        <w:keepLines/>
+        <w:spacing w:after="80"/>
+        <w:ind w:left="280"/>
+      </w:pPr>
+      <w:r>
+        <w:t xml:space="preserve">Practically all of the code was written by the AI - I estimate over 95%; I did not type the code myself. But it was far from "just prompts": every decision went through me - the architecture, the framework, what to include and leave out, and how it should look and behave compared to my JavaFX client.</w:t>
+      </w:r>
+    </w:p>
+    <w:p>
+      <w:pPr>
+        <w:keepNext w:val="false"/>
+        <w:keepLines/>
         <w:spacing w:after="120"/>
-      </w:pPr>
-      <w:r>
-        <w:t xml:space="preserve">Practically all of the code was written by the AI - I estimate over 95%; I did not type the code myself. But it was far from "just prompts": every decision went through me - the architecture, the framework, what to include and leave out, and how it should look and behave compared to my JavaFX client. I made sure I understood how the parts connect (the proxy, React redrawing only what changed, polling every second, which endpoints are used) before moving on, tested each step myself in the browser, and sent things back when they did not match. In short: the AI wrote it; I directed, reviewed and tested it.</w:t>
-      </w:r>
-    </w:p>
-    <w:p>
-      <w:pPr>
-        <w:pStyle w:val="Heading2"/>
-      </w:pPr>
-      <w:r>
+        <w:ind w:left="280"/>
+      </w:pPr>
+      <w:r>
+        <w:t xml:space="preserve">I made sure I understood how the parts connect (the proxy, React redrawing only what changed, polling every second, which endpoints are used) before moving on, tested each step myself in the browser, and sent things back when they did not match. In short: the AI wrote it; I directed, reviewed and tested it.</w:t>
+      </w:r>
+    </w:p>
+    <w:p>
+      <w:pPr>
+        <w:keepNext/>
+        <w:keepLines/>
+        <w:spacing w:after="100" w:before="320"/>
+      </w:pPr>
+      <w:r>
+        <w:rPr>
+          <w:b/>
+          <w:bCs/>
+          <w:sz w:val="24"/>
+          <w:szCs w:val="24"/>
+        </w:rPr>
         <w:t xml:space="preserve">How long did it take? How long would it have taken without AI?</w:t>
       </w:r>
     </w:p>
     <w:p>
       <w:pPr>
+        <w:keepNext w:val="false"/>
+        <w:keepLines/>
         <w:spacing w:after="120"/>
+        <w:ind w:left="280"/>
       </w:pPr>
       <w:r>
         <w:t xml:space="preserve">About two and a half hours in one evening - from installing Node.js to a tested, packaged client with its readme, including the discussion before any code was written. Without AI I estimate one to two weeks: learning React and the browser's rules from scratch, then building three screens with trading, and debugging.</w:t>
@@ -4185,15 +5692,26 @@
     </w:p>
     <w:p>
       <w:pPr>
-        <w:pStyle w:val="Heading2"/>
-      </w:pPr>
-      <w:r>
+        <w:keepNext/>
+        <w:keepLines/>
+        <w:spacing w:after="100" w:before="320"/>
+      </w:pPr>
+      <w:r>
+        <w:rPr>
+          <w:b/>
+          <w:bCs/>
+          <w:sz w:val="24"/>
+          <w:szCs w:val="24"/>
+        </w:rPr>
         <w:t xml:space="preserve">Did you have prior front-end experience? Did it help?</w:t>
       </w:r>
     </w:p>
     <w:p>
       <w:pPr>
+        <w:keepNext w:val="false"/>
+        <w:keepLines/>
         <w:spacing w:after="120"/>
+        <w:ind w:left="280"/>
       </w:pPr>
       <w:r>
         <w:t xml:space="preserve">Only a little HTML and CSS - no JavaScript frameworks. It helped a bit with reading the layout and styling, but React, Vite, Node.js and the same-origin/CORS rule were all new to me; I learned each one by asking the AI to explain it at my level before building on it.</w:t>
@@ -4201,18 +5719,40 @@
     </w:p>
     <w:p>
       <w:pPr>
-        <w:pStyle w:val="Heading2"/>
-      </w:pPr>
-      <w:r>
+        <w:keepNext/>
+        <w:keepLines/>
+        <w:spacing w:after="100" w:before="320"/>
+      </w:pPr>
+      <w:r>
+        <w:rPr>
+          <w:b/>
+          <w:bCs/>
+          <w:sz w:val="24"/>
+          <w:szCs w:val="24"/>
+        </w:rPr>
         <w:t xml:space="preserve">Compared with the rest of the course, was this AI-guided way of working fun?</w:t>
       </w:r>
     </w:p>
     <w:p>
       <w:pPr>
+        <w:keepNext/>
+        <w:keepLines/>
+        <w:spacing w:after="80"/>
+        <w:ind w:left="280"/>
+      </w:pPr>
+      <w:r>
+        <w:t xml:space="preserve">Yes. Seeing a working web version of my app appear in one evening - matching my JavaFX client and talking to the server I built in Exercise 3 - was genuinely fun. What kept it satisfying was staying hands-on: insisting on understanding why things work, catching what the AI missed, and making the decisions myself.</w:t>
+      </w:r>
+    </w:p>
+    <w:p>
+      <w:pPr>
+        <w:keepNext w:val="false"/>
+        <w:keepLines/>
         <w:spacing w:after="120"/>
-      </w:pPr>
-      <w:r>
-        <w:t xml:space="preserve">Yes. Seeing a working web version of my app appear in one evening - matching my JavaFX client and talking to the server I built in Exercise 3 - was genuinely fun. What kept it satisfying was staying hands-on: insisting on understanding why things work, catching what the AI missed, and making the decisions myself. Exercises 1-3 taught me more about Java itself; this one taught me how to direct and check an AI's work - a different skill, and a useful one.</w:t>
+        <w:ind w:left="280"/>
+      </w:pPr>
+      <w:r>
+        <w:t xml:space="preserve">Exercises 1-3 taught me more about Java itself; this one taught me how to direct and check an AI's work - a different skill, and a useful one.</w:t>
       </w:r>
     </w:p>
     <w:sectPr>
@@ -4401,6 +5941,18 @@
     <w:multiLevelType w:val="hybridMultilevel"/>
     <w:lvl w:ilvl="0" w:tentative="1">
       <w:start w:val="1"/>
+      <w:numFmt w:val="bullet"/>
+      <w:lvlText w:val="•"/>
+      <w:lvlJc w:val="left"/>
+      <w:pPr>
+        <w:ind w:left="640" w:hanging="270"/>
+      </w:pPr>
+    </w:lvl>
+  </w:abstractNum>
+  <w:abstractNum w:abstractNumId="4" w15:restartNumberingAfterBreak="0">
+    <w:multiLevelType w:val="hybridMultilevel"/>
+    <w:lvl w:ilvl="0" w:tentative="1">
+      <w:start w:val="1"/>
       <w:numFmt w:val="decimal"/>
       <w:lvlText w:val="%1."/>
       <w:lvlJc w:val="left"/>
@@ -4416,13 +5968,19 @@
     </w:lvlOverride>
   </w:num>
   <w:num w:numId="2">
-    <w:abstractNumId w:val="3"/>
+    <w:abstractNumId w:val="4"/>
     <w:lvlOverride w:ilvl="0">
       <w:startOverride w:val="1"/>
     </w:lvlOverride>
   </w:num>
   <w:num w:numId="3">
     <w:abstractNumId w:val="2"/>
+    <w:lvlOverride w:ilvl="0">
+      <w:startOverride w:val="1"/>
+    </w:lvlOverride>
+  </w:num>
+  <w:num w:numId="4">
+    <w:abstractNumId w:val="3"/>
     <w:lvlOverride w:ilvl="0">
       <w:startOverride w:val="1"/>
     </w:lvlOverride>
@@ -4618,7 +6176,7 @@
     <w:pPr>
       <w:keepNext/>
       <w:keepLines/>
-      <w:spacing w:after="120" w:before="400"/>
+      <w:spacing w:after="160" w:before="400"/>
       <w:outlineLvl w:val="0"/>
     </w:pPr>
     <w:rPr>

</xml_diff>